<commit_message>
Update documentation and hided 'runSimulation' script Breakpoint distribution detailed runSimulation hidden because too long to run
</commit_message>
<xml_diff>
--- a/inst/simStudyProtocol - Appendix A.docx
+++ b/inst/simStudyProtocol - Appendix A.docx
@@ -62,16 +62,105 @@
         <w:rPr>
           <w:lang w:val="en-US"/>
         </w:rPr>
-        <w:t>/github/mixedBreak/test/distrib-breaks.R</w:t>
-      </w:r>
+        <w:t>/</w:t>
+      </w:r>
+      <w:proofErr w:type="spellStart"/>
+      <w:r>
+        <w:rPr>
+          <w:lang w:val="en-US"/>
+        </w:rPr>
+        <w:t>github</w:t>
+      </w:r>
+      <w:proofErr w:type="spellEnd"/>
+      <w:r>
+        <w:rPr>
+          <w:lang w:val="en-US"/>
+        </w:rPr>
+        <w:t>/</w:t>
+      </w:r>
+      <w:proofErr w:type="spellStart"/>
+      <w:r>
+        <w:rPr>
+          <w:lang w:val="en-US"/>
+        </w:rPr>
+        <w:t>mixedBreak</w:t>
+      </w:r>
+      <w:proofErr w:type="spellEnd"/>
+      <w:r>
+        <w:rPr>
+          <w:lang w:val="en-US"/>
+        </w:rPr>
+        <w:t>/test/</w:t>
+      </w:r>
+      <w:proofErr w:type="spellStart"/>
+      <w:r>
+        <w:rPr>
+          <w:lang w:val="en-US"/>
+        </w:rPr>
+        <w:t>distrib-</w:t>
+      </w:r>
+      <w:proofErr w:type="gramStart"/>
+      <w:r>
+        <w:rPr>
+          <w:lang w:val="en-US"/>
+        </w:rPr>
+        <w:t>breaks.R</w:t>
+      </w:r>
+      <w:proofErr w:type="spellEnd"/>
+      <w:proofErr w:type="gramEnd"/>
     </w:p>
     <w:p>
       <w:pPr>
+        <w:ind w:firstLine="851"/>
         <w:jc w:val="both"/>
         <w:rPr>
           <w:lang w:val="en-US"/>
         </w:rPr>
       </w:pPr>
+      <w:r>
+        <w:rPr>
+          <w:lang w:val="en-US"/>
+        </w:rPr>
+        <w:t xml:space="preserve">One of the main goals of the simulation study is to generate fictive patients to benefit from having a large amount of data for </w:t>
+      </w:r>
+      <w:r>
+        <w:rPr>
+          <w:lang w:val="en-US"/>
+        </w:rPr>
+        <w:t xml:space="preserve">model </w:t>
+      </w:r>
+      <w:r>
+        <w:rPr>
+          <w:lang w:val="en-US"/>
+        </w:rPr>
+        <w:t xml:space="preserve">evaluation. But most importantly, we need to generate patient that </w:t>
+      </w:r>
+      <w:r>
+        <w:rPr>
+          <w:i/>
+          <w:iCs/>
+          <w:lang w:val="en-US"/>
+        </w:rPr>
+        <w:t>looks like</w:t>
+      </w:r>
+      <w:r>
+        <w:rPr>
+          <w:lang w:val="en-US"/>
+        </w:rPr>
+        <w:t xml:space="preserve"> real patients, up to a certain noise level that we</w:t>
+      </w:r>
+      <w:r>
+        <w:rPr>
+          <w:lang w:val="en-US"/>
+        </w:rPr>
+        <w:t xml:space="preserve"> can</w:t>
+      </w:r>
+      <w:r>
+        <w:rPr>
+          <w:lang w:val="en-US"/>
+        </w:rPr>
+        <w:t xml:space="preserve"> control.</w:t>
+      </w:r>
     </w:p>
     <w:p>
       <w:pPr>
@@ -85,59 +174,6 @@
         <w:rPr>
           <w:lang w:val="en-US"/>
         </w:rPr>
-        <w:t xml:space="preserve">One of the main goals of the simulation study is to generate fictive patients to benefit from having a large amount of data for </w:t>
-      </w:r>
-      <w:r>
-        <w:rPr>
-          <w:lang w:val="en-US"/>
-        </w:rPr>
-        <w:t xml:space="preserve">model </w:t>
-      </w:r>
-      <w:r>
-        <w:rPr>
-          <w:lang w:val="en-US"/>
-        </w:rPr>
-        <w:t xml:space="preserve">evaluation. But most importantly, we need to generate patient that </w:t>
-      </w:r>
-      <w:r>
-        <w:rPr>
-          <w:i/>
-          <w:iCs/>
-          <w:lang w:val="en-US"/>
-        </w:rPr>
-        <w:t>looks like</w:t>
-      </w:r>
-      <w:r>
-        <w:rPr>
-          <w:lang w:val="en-US"/>
-        </w:rPr>
-        <w:t xml:space="preserve"> real patients, up to a certain noise level that we</w:t>
-      </w:r>
-      <w:r>
-        <w:rPr>
-          <w:lang w:val="en-US"/>
-        </w:rPr>
-        <w:t xml:space="preserve"> can</w:t>
-      </w:r>
-      <w:r>
-        <w:rPr>
-          <w:lang w:val="en-US"/>
-        </w:rPr>
-        <w:t xml:space="preserve"> control.</w:t>
-      </w:r>
-    </w:p>
-    <w:p>
-      <w:pPr>
-        <w:ind w:firstLine="851"/>
-        <w:jc w:val="both"/>
-        <w:rPr>
-          <w:lang w:val="en-US"/>
-        </w:rPr>
-      </w:pPr>
-      <w:r>
-        <w:rPr>
-          <w:lang w:val="en-US"/>
-        </w:rPr>
         <w:t xml:space="preserve">A </w:t>
       </w:r>
       <w:r>
@@ -162,9 +198,23 @@
         <w:rPr>
           <w:lang w:val="en-US"/>
         </w:rPr>
-        <w:t>in Stenbæck et al. (</w:t>
-      </w:r>
-      <w:hyperlink r:id="rId5" w:history="1">
+        <w:t xml:space="preserve">in </w:t>
+      </w:r>
+      <w:proofErr w:type="spellStart"/>
+      <w:r>
+        <w:rPr>
+          <w:lang w:val="en-US"/>
+        </w:rPr>
+        <w:t>Stenbæck</w:t>
+      </w:r>
+      <w:proofErr w:type="spellEnd"/>
+      <w:r>
+        <w:rPr>
+          <w:lang w:val="en-US"/>
+        </w:rPr>
+        <w:t xml:space="preserve"> et al. (</w:t>
+      </w:r>
+      <w:hyperlink r:id="rId6" w:history="1">
         <w:r>
           <w:rPr>
             <w:rStyle w:val="Hyperlink"/>
@@ -189,7 +239,21 @@
         <w:rPr>
           <w:lang w:val="en-US"/>
         </w:rPr>
-        <w:t xml:space="preserve"> (mean (sd) [range] in minutes after drug intake):</w:t>
+        <w:t xml:space="preserve"> (mean (</w:t>
+      </w:r>
+      <w:proofErr w:type="spellStart"/>
+      <w:r>
+        <w:rPr>
+          <w:lang w:val="en-US"/>
+        </w:rPr>
+        <w:t>sd</w:t>
+      </w:r>
+      <w:proofErr w:type="spellEnd"/>
+      <w:r>
+        <w:rPr>
+          <w:lang w:val="en-US"/>
+        </w:rPr>
+        <w:t>) [range] in minutes after drug intake):</w:t>
       </w:r>
     </w:p>
     <w:p>
@@ -214,7 +278,21 @@
         <w:rPr>
           <w:lang w:val="en-US"/>
         </w:rPr>
-        <w:t>77.2 (38.2) [32.5 ; 157.9]</w:t>
+        <w:t>77.2 (38.2) [</w:t>
+      </w:r>
+      <w:proofErr w:type="gramStart"/>
+      <w:r>
+        <w:rPr>
+          <w:lang w:val="en-US"/>
+        </w:rPr>
+        <w:t>32.5 ;</w:t>
+      </w:r>
+      <w:proofErr w:type="gramEnd"/>
+      <w:r>
+        <w:rPr>
+          <w:lang w:val="en-US"/>
+        </w:rPr>
+        <w:t xml:space="preserve"> 157.9]</w:t>
       </w:r>
     </w:p>
     <w:p>
@@ -239,7 +317,21 @@
         <w:rPr>
           <w:lang w:val="en-US"/>
         </w:rPr>
-        <w:t>77.5 (33.3) [29.0 ; 142.8]</w:t>
+        <w:t>77.5 (33.3) [</w:t>
+      </w:r>
+      <w:proofErr w:type="gramStart"/>
+      <w:r>
+        <w:rPr>
+          <w:lang w:val="en-US"/>
+        </w:rPr>
+        <w:t>29.0 ;</w:t>
+      </w:r>
+      <w:proofErr w:type="gramEnd"/>
+      <w:r>
+        <w:rPr>
+          <w:lang w:val="en-US"/>
+        </w:rPr>
+        <w:t xml:space="preserve"> 142.8]</w:t>
       </w:r>
     </w:p>
     <w:p>
@@ -264,7 +356,21 @@
         <w:rPr>
           <w:lang w:val="en-US"/>
         </w:rPr>
-        <w:t>131.6 (39.3) [90.0 ; 204.1]</w:t>
+        <w:t>131.6 (39.3) [</w:t>
+      </w:r>
+      <w:proofErr w:type="gramStart"/>
+      <w:r>
+        <w:rPr>
+          <w:lang w:val="en-US"/>
+        </w:rPr>
+        <w:t>90.0 ;</w:t>
+      </w:r>
+      <w:proofErr w:type="gramEnd"/>
+      <w:r>
+        <w:rPr>
+          <w:lang w:val="en-US"/>
+        </w:rPr>
+        <w:t xml:space="preserve"> 204.1]</w:t>
       </w:r>
     </w:p>
     <w:p>
@@ -289,6 +395,7 @@
       </w:pPr>
       <w:r>
         <w:rPr>
+          <w:noProof/>
           <w:lang w:val="en-US"/>
         </w:rPr>
         <w:drawing>
@@ -307,7 +414,7 @@
                     <pic:cNvPicPr/>
                   </pic:nvPicPr>
                   <pic:blipFill rotWithShape="1">
-                    <a:blip r:embed="rId6"/>
+                    <a:blip r:embed="rId7"/>
                     <a:srcRect l="444" r="-1"/>
                     <a:stretch>
                       <a:fillRect/>
@@ -395,46 +502,2465 @@
     </w:p>
     <w:p>
       <w:pPr>
-        <w:rPr>
-          <w:lang w:val="en-US"/>
-        </w:rPr>
-      </w:pPr>
-      <w:r>
-        <w:rPr>
+        <w:jc w:val="center"/>
+        <w:rPr>
+          <w:sz w:val="32"/>
+          <w:szCs w:val="32"/>
+          <w:u w:val="single"/>
+          <w:lang w:val="en-US"/>
+        </w:rPr>
+      </w:pPr>
+      <w:r>
+        <w:rPr>
+          <w:sz w:val="32"/>
+          <w:szCs w:val="32"/>
+          <w:u w:val="single"/>
           <w:lang w:val="en-US"/>
         </w:rPr>
         <w:lastRenderedPageBreak/>
-        <w:t>Specifying a multivariate gaussian breakpoint distribution</w:t>
+        <w:t>Correlating breakpoints’ coordinates for controlling ratio</w:t>
       </w:r>
     </w:p>
     <w:p>
       <w:pPr>
-        <w:pStyle w:val="ListParagraph"/>
-        <w:numPr>
-          <w:ilvl w:val="0"/>
-          <w:numId w:val="3"/>
-        </w:numPr>
-        <w:rPr>
-          <w:lang w:val="en-US"/>
-        </w:rPr>
-      </w:pPr>
-      <w:r>
-        <w:rPr>
-          <w:lang w:val="en-US"/>
-        </w:rPr>
-        <w:t xml:space="preserve">Correlation helps specifying the mean of ratio Y/X (see full details at </w:t>
-      </w:r>
-      <w:r>
-        <w:rPr>
-          <w:lang w:val="en-US"/>
-        </w:rPr>
-        <w:t>/student/noahdegoulange/github/mixedBreak/test/distrib-breaks.R</w:t>
-      </w:r>
-      <w:r>
-        <w:rPr>
-          <w:lang w:val="en-US"/>
-        </w:rPr>
-        <w:t>) but only under certain conditions on the scale parameters of the ratio Y/X</w:t>
+        <w:ind w:firstLine="851"/>
+        <w:rPr>
+          <w:lang w:val="en-US"/>
+        </w:rPr>
+      </w:pPr>
+      <w:r>
+        <w:rPr>
+          <w:lang w:val="en-US"/>
+        </w:rPr>
+        <w:t>Parameters of clinical interest are the onset slope, the duration of plateau, the return to normal consciousness slope, so one might consider simulating based on their distribution, instead of the breakpoints that have a less direct interpretation.</w:t>
+      </w:r>
+    </w:p>
+    <w:p>
+      <w:pPr>
+        <w:ind w:firstLine="851"/>
+        <w:rPr>
+          <w:lang w:val="en-US"/>
+        </w:rPr>
+      </w:pPr>
+      <w:r>
+        <w:rPr>
+          <w:lang w:val="en-US"/>
+        </w:rPr>
+        <w:t>If simulating the slopes coefficients directly is possible, is raises some issues due to the limited range of the SDI scale (0-10). It is mostly desirable to simulate breakpoints</w:t>
+      </w:r>
+      <w:r>
+        <w:rPr>
+          <w:lang w:val="en-US"/>
+        </w:rPr>
+        <w:t xml:space="preserve"> instead of slopes</w:t>
+      </w:r>
+      <w:r>
+        <w:rPr>
+          <w:lang w:val="en-US"/>
+        </w:rPr>
+        <w:t>??</w:t>
+      </w:r>
+      <w:r>
+        <w:rPr>
+          <w:lang w:val="en-US"/>
+        </w:rPr>
+        <w:t xml:space="preserve"> </w:t>
+      </w:r>
+      <w:r>
+        <w:rPr>
+          <w:highlight w:val="yellow"/>
+          <w:lang w:val="en-US"/>
+        </w:rPr>
+        <w:t>Is it??</w:t>
+      </w:r>
+      <w:r>
+        <w:rPr>
+          <w:lang w:val="en-US"/>
+        </w:rPr>
+        <w:t xml:space="preserve"> Problematic resides in the boundaries of the domain (time &gt; 0, 0&lt; SDI &lt; 10, breakpoints are ordered and distance between them is strictly positive).</w:t>
+      </w:r>
+    </w:p>
+    <w:p>
+      <w:pPr>
+        <w:ind w:firstLine="851"/>
+        <w:rPr>
+          <w:lang w:val="en-US"/>
+        </w:rPr>
+      </w:pPr>
+      <w:r>
+        <w:rPr>
+          <w:lang w:val="en-US"/>
+        </w:rPr>
+        <w:t>However, the slopes are the ratio of the y/x coordinates of breakpoints, so we don’t know the exact distribution of this quantity. On idea is drawing x and y jointly through and multivariate normal law. With a proper correlation specification, we could set up at least the average value of the ratio:</w:t>
+      </w:r>
+    </w:p>
+    <w:p>
+      <w:pPr>
+        <w:ind w:firstLine="851"/>
+        <w:rPr>
+          <w:rFonts w:eastAsiaTheme="minorEastAsia"/>
+          <w:lang w:val="en-US"/>
+        </w:rPr>
+      </w:pPr>
+      <w:r>
+        <w:rPr>
+          <w:lang w:val="en-US"/>
+        </w:rPr>
+        <w:t>Intuitively, the correlation “shifts” the density ellipse of the multivariate normal distribution. If we can find a correlation value that shifts the ellipse so its semi-</w:t>
+      </w:r>
+      <w:r>
+        <w:rPr>
+          <w:lang w:val="en-US"/>
+        </w:rPr>
+        <w:t xml:space="preserve">major </w:t>
+      </w:r>
+      <w:r>
+        <w:rPr>
+          <w:lang w:val="en-US"/>
+        </w:rPr>
+        <w:t>ax</w:t>
+      </w:r>
+      <w:r>
+        <w:rPr>
+          <w:lang w:val="en-US"/>
+        </w:rPr>
+        <w:t>i</w:t>
+      </w:r>
+      <w:r>
+        <w:rPr>
+          <w:lang w:val="en-US"/>
+        </w:rPr>
+        <w:t xml:space="preserve">s is aligned with the </w:t>
+      </w:r>
+      <w:r>
+        <w:rPr>
+          <w:lang w:val="en-US"/>
+        </w:rPr>
+        <w:t xml:space="preserve">line of directing coefficient </w:t>
+      </w:r>
+      <m:oMath>
+        <m:sSub>
+          <m:sSubPr>
+            <m:ctrlPr>
+              <w:rPr>
+                <w:rFonts w:ascii="Cambria Math" w:hAnsi="Cambria Math"/>
+                <w:i/>
+                <w:lang w:val="en-US"/>
+              </w:rPr>
+            </m:ctrlPr>
+          </m:sSubPr>
+          <m:e>
+            <m:r>
+              <w:rPr>
+                <w:rFonts w:ascii="Cambria Math" w:hAnsi="Cambria Math"/>
+                <w:lang w:val="en-US"/>
+              </w:rPr>
+              <m:t>β</m:t>
+            </m:r>
+          </m:e>
+          <m:sub>
+            <m:r>
+              <w:rPr>
+                <w:rFonts w:ascii="Cambria Math" w:hAnsi="Cambria Math"/>
+                <w:lang w:val="en-US"/>
+              </w:rPr>
+              <m:t>onset</m:t>
+            </m:r>
+          </m:sub>
+        </m:sSub>
+      </m:oMath>
+      <w:r>
+        <w:rPr>
+          <w:rFonts w:eastAsiaTheme="minorEastAsia"/>
+          <w:lang w:val="en-US"/>
+        </w:rPr>
+        <w:t xml:space="preserve">, then we control the </w:t>
+      </w:r>
+      <w:r>
+        <w:rPr>
+          <w:rFonts w:eastAsiaTheme="minorEastAsia"/>
+          <w:lang w:val="en-US"/>
+        </w:rPr>
+        <w:t>first moments</w:t>
+      </w:r>
+      <w:r>
+        <w:rPr>
+          <w:rFonts w:eastAsiaTheme="minorEastAsia"/>
+          <w:lang w:val="en-US"/>
+        </w:rPr>
+        <w:t xml:space="preserve"> of ratio </w:t>
+      </w:r>
+      <m:oMath>
+        <m:f>
+          <m:fPr>
+            <m:ctrlPr>
+              <w:rPr>
+                <w:rFonts w:ascii="Cambria Math" w:eastAsiaTheme="minorEastAsia" w:hAnsi="Cambria Math"/>
+                <w:i/>
+                <w:lang w:val="en-US"/>
+              </w:rPr>
+            </m:ctrlPr>
+          </m:fPr>
+          <m:num>
+            <m:r>
+              <w:rPr>
+                <w:rFonts w:ascii="Cambria Math" w:eastAsiaTheme="minorEastAsia" w:hAnsi="Cambria Math"/>
+                <w:lang w:val="en-US"/>
+              </w:rPr>
+              <m:t>y</m:t>
+            </m:r>
+          </m:num>
+          <m:den>
+            <m:r>
+              <w:rPr>
+                <w:rFonts w:ascii="Cambria Math" w:eastAsiaTheme="minorEastAsia" w:hAnsi="Cambria Math"/>
+                <w:lang w:val="en-US"/>
+              </w:rPr>
+              <m:t>x</m:t>
+            </m:r>
+          </m:den>
+        </m:f>
+      </m:oMath>
+      <w:r>
+        <w:rPr>
+          <w:rFonts w:eastAsiaTheme="minorEastAsia"/>
+          <w:lang w:val="en-US"/>
+        </w:rPr>
+        <w:t>.</w:t>
+      </w:r>
+      <w:r>
+        <w:rPr>
+          <w:rFonts w:eastAsiaTheme="minorEastAsia"/>
+          <w:lang w:val="en-US"/>
+        </w:rPr>
+        <w:t xml:space="preserve"> In practice we have </w:t>
+      </w:r>
+      <m:oMath>
+        <m:sSub>
+          <m:sSubPr>
+            <m:ctrlPr>
+              <w:rPr>
+                <w:rFonts w:ascii="Cambria Math" w:eastAsiaTheme="minorEastAsia" w:hAnsi="Cambria Math"/>
+                <w:i/>
+                <w:lang w:val="en-US"/>
+              </w:rPr>
+            </m:ctrlPr>
+          </m:sSubPr>
+          <m:e>
+            <m:r>
+              <w:rPr>
+                <w:rFonts w:ascii="Cambria Math" w:eastAsiaTheme="minorEastAsia" w:hAnsi="Cambria Math"/>
+                <w:lang w:val="en-US"/>
+              </w:rPr>
+              <m:t>σ</m:t>
+            </m:r>
+          </m:e>
+          <m:sub>
+            <m:r>
+              <w:rPr>
+                <w:rFonts w:ascii="Cambria Math" w:eastAsiaTheme="minorEastAsia" w:hAnsi="Cambria Math"/>
+                <w:lang w:val="en-US"/>
+              </w:rPr>
+              <m:t>X</m:t>
+            </m:r>
+          </m:sub>
+        </m:sSub>
+        <m:r>
+          <w:rPr>
+            <w:rFonts w:ascii="Cambria Math" w:eastAsiaTheme="minorEastAsia" w:hAnsi="Cambria Math"/>
+            <w:lang w:val="en-US"/>
+          </w:rPr>
+          <m:t>≫</m:t>
+        </m:r>
+        <m:sSub>
+          <m:sSubPr>
+            <m:ctrlPr>
+              <w:rPr>
+                <w:rFonts w:ascii="Cambria Math" w:eastAsiaTheme="minorEastAsia" w:hAnsi="Cambria Math"/>
+                <w:i/>
+                <w:lang w:val="en-US"/>
+              </w:rPr>
+            </m:ctrlPr>
+          </m:sSubPr>
+          <m:e>
+            <m:r>
+              <w:rPr>
+                <w:rFonts w:ascii="Cambria Math" w:eastAsiaTheme="minorEastAsia" w:hAnsi="Cambria Math"/>
+                <w:lang w:val="en-US"/>
+              </w:rPr>
+              <m:t>σ</m:t>
+            </m:r>
+          </m:e>
+          <m:sub>
+            <m:r>
+              <w:rPr>
+                <w:rFonts w:ascii="Cambria Math" w:eastAsiaTheme="minorEastAsia" w:hAnsi="Cambria Math"/>
+                <w:lang w:val="en-US"/>
+              </w:rPr>
+              <m:t>Y</m:t>
+            </m:r>
+          </m:sub>
+        </m:sSub>
+      </m:oMath>
+      <w:r>
+        <w:rPr>
+          <w:rFonts w:eastAsiaTheme="minorEastAsia"/>
+          <w:lang w:val="en-US"/>
+        </w:rPr>
+        <w:t xml:space="preserve"> so we prefer to align the semi-major axis to induce lower ratio variance.</w:t>
+      </w:r>
+    </w:p>
+    <w:p>
+      <w:pPr>
+        <w:keepNext/>
+      </w:pPr>
+      <w:r>
+        <w:rPr>
+          <w:noProof/>
+        </w:rPr>
+        <w:drawing>
+          <wp:inline distT="0" distB="0" distL="0" distR="0" wp14:anchorId="66465F92" wp14:editId="5E343240">
+            <wp:extent cx="5731510" cy="1461135"/>
+            <wp:effectExtent l="0" t="0" r="2540" b="5715"/>
+            <wp:docPr id="1378342312" name="Picture 1"/>
+            <wp:cNvGraphicFramePr>
+              <a:graphicFrameLocks xmlns:a="http://schemas.openxmlformats.org/drawingml/2006/main" noChangeAspect="1"/>
+            </wp:cNvGraphicFramePr>
+            <a:graphic xmlns:a="http://schemas.openxmlformats.org/drawingml/2006/main">
+              <a:graphicData uri="http://schemas.openxmlformats.org/drawingml/2006/picture">
+                <pic:pic xmlns:pic="http://schemas.openxmlformats.org/drawingml/2006/picture">
+                  <pic:nvPicPr>
+                    <pic:cNvPr id="1378342312" name=""/>
+                    <pic:cNvPicPr/>
+                  </pic:nvPicPr>
+                  <pic:blipFill>
+                    <a:blip r:embed="rId8"/>
+                    <a:stretch>
+                      <a:fillRect/>
+                    </a:stretch>
+                  </pic:blipFill>
+                  <pic:spPr>
+                    <a:xfrm>
+                      <a:off x="0" y="0"/>
+                      <a:ext cx="5731510" cy="1461135"/>
+                    </a:xfrm>
+                    <a:prstGeom prst="rect">
+                      <a:avLst/>
+                    </a:prstGeom>
+                  </pic:spPr>
+                </pic:pic>
+              </a:graphicData>
+            </a:graphic>
+          </wp:inline>
+        </w:drawing>
+      </w:r>
+    </w:p>
+    <w:p>
+      <w:pPr>
+        <w:pStyle w:val="Caption"/>
+        <w:jc w:val="center"/>
+        <w:rPr>
+          <w:lang w:val="en-US"/>
+        </w:rPr>
+      </w:pPr>
+      <w:r>
+        <w:rPr>
+          <w:lang w:val="en-US"/>
+        </w:rPr>
+        <w:t xml:space="preserve">Figure </w:t>
+      </w:r>
+      <w:r>
+        <w:fldChar w:fldCharType="begin"/>
+      </w:r>
+      <w:r>
+        <w:rPr>
+          <w:lang w:val="en-US"/>
+        </w:rPr>
+        <w:instrText xml:space="preserve"> SEQ Figure \* ARABIC </w:instrText>
+      </w:r>
+      <w:r>
+        <w:fldChar w:fldCharType="separate"/>
+      </w:r>
+      <w:r>
+        <w:rPr>
+          <w:noProof/>
+          <w:lang w:val="en-US"/>
+        </w:rPr>
+        <w:t>2</w:t>
+      </w:r>
+      <w:r>
+        <w:fldChar w:fldCharType="end"/>
+      </w:r>
+      <w:r>
+        <w:rPr>
+          <w:lang w:val="en-US"/>
+        </w:rPr>
+        <w:t xml:space="preserve"> - (</w:t>
+      </w:r>
+      <w:proofErr w:type="spellStart"/>
+      <w:proofErr w:type="gramStart"/>
+      <w:r>
+        <w:rPr>
+          <w:lang w:val="en-US"/>
+        </w:rPr>
+        <w:t>x,y</w:t>
+      </w:r>
+      <w:proofErr w:type="spellEnd"/>
+      <w:proofErr w:type="gramEnd"/>
+      <w:r>
+        <w:rPr>
+          <w:lang w:val="en-US"/>
+        </w:rPr>
+        <w:t xml:space="preserve">) multivariate normal distribution with means = (63.9,9), </w:t>
+      </w:r>
+      <w:proofErr w:type="spellStart"/>
+      <w:r>
+        <w:rPr>
+          <w:lang w:val="en-US"/>
+        </w:rPr>
+        <w:t>sd</w:t>
+      </w:r>
+      <w:proofErr w:type="spellEnd"/>
+      <w:r>
+        <w:rPr>
+          <w:lang w:val="en-US"/>
+        </w:rPr>
+        <w:t>=(</w:t>
+      </w:r>
+      <w:proofErr w:type="gramStart"/>
+      <w:r>
+        <w:rPr>
+          <w:lang w:val="en-US"/>
+        </w:rPr>
+        <w:t>sqrt(</w:t>
+      </w:r>
+      <w:proofErr w:type="gramEnd"/>
+      <w:r>
+        <w:rPr>
+          <w:lang w:val="en-US"/>
+        </w:rPr>
+        <w:t>33),1) and rho = 0 (left) and 0.81 (right)</w:t>
+      </w:r>
+      <w:r>
+        <w:rPr>
+          <w:lang w:val="en-US"/>
+        </w:rPr>
+        <w:t xml:space="preserve">. Black line is the target with coefficient </w:t>
+      </w:r>
+      <w:proofErr w:type="spellStart"/>
+      <w:r>
+        <w:rPr>
+          <w:lang w:val="en-US"/>
+        </w:rPr>
+        <w:t>beta_onset</w:t>
+      </w:r>
+      <w:proofErr w:type="spellEnd"/>
+      <w:r>
+        <w:rPr>
+          <w:lang w:val="en-US"/>
+        </w:rPr>
+        <w:t>, and red line is the BLUP of y given x and rho.</w:t>
+      </w:r>
+      <w:r>
+        <w:rPr>
+          <w:lang w:val="en-US"/>
+        </w:rPr>
+        <w:t xml:space="preserve"> N = 10 000.</w:t>
+      </w:r>
+    </w:p>
+    <w:p>
+      <w:pPr>
+        <w:keepNext/>
+      </w:pPr>
+      <w:r>
+        <w:rPr>
+          <w:noProof/>
+          <w:lang w:val="en-US"/>
+        </w:rPr>
+        <w:drawing>
+          <wp:inline distT="0" distB="0" distL="0" distR="0" wp14:anchorId="4B8E7CE2" wp14:editId="75052A1A">
+            <wp:extent cx="5731510" cy="1436370"/>
+            <wp:effectExtent l="0" t="0" r="2540" b="0"/>
+            <wp:docPr id="72723439" name="Picture 1"/>
+            <wp:cNvGraphicFramePr>
+              <a:graphicFrameLocks xmlns:a="http://schemas.openxmlformats.org/drawingml/2006/main" noChangeAspect="1"/>
+            </wp:cNvGraphicFramePr>
+            <a:graphic xmlns:a="http://schemas.openxmlformats.org/drawingml/2006/main">
+              <a:graphicData uri="http://schemas.openxmlformats.org/drawingml/2006/picture">
+                <pic:pic xmlns:pic="http://schemas.openxmlformats.org/drawingml/2006/picture">
+                  <pic:nvPicPr>
+                    <pic:cNvPr id="72723439" name=""/>
+                    <pic:cNvPicPr/>
+                  </pic:nvPicPr>
+                  <pic:blipFill>
+                    <a:blip r:embed="rId9"/>
+                    <a:stretch>
+                      <a:fillRect/>
+                    </a:stretch>
+                  </pic:blipFill>
+                  <pic:spPr>
+                    <a:xfrm>
+                      <a:off x="0" y="0"/>
+                      <a:ext cx="5731510" cy="1436370"/>
+                    </a:xfrm>
+                    <a:prstGeom prst="rect">
+                      <a:avLst/>
+                    </a:prstGeom>
+                  </pic:spPr>
+                </pic:pic>
+              </a:graphicData>
+            </a:graphic>
+          </wp:inline>
+        </w:drawing>
+      </w:r>
+    </w:p>
+    <w:p>
+      <w:pPr>
+        <w:pStyle w:val="Caption"/>
+        <w:jc w:val="center"/>
+        <w:rPr>
+          <w:noProof/>
+          <w:lang w:val="en-US"/>
+        </w:rPr>
+      </w:pPr>
+      <w:r>
+        <w:rPr>
+          <w:lang w:val="en-US"/>
+        </w:rPr>
+        <w:t xml:space="preserve">Figure </w:t>
+      </w:r>
+      <w:r>
+        <w:fldChar w:fldCharType="begin"/>
+      </w:r>
+      <w:r>
+        <w:rPr>
+          <w:lang w:val="en-US"/>
+        </w:rPr>
+        <w:instrText xml:space="preserve"> SEQ Figure \* ARABIC </w:instrText>
+      </w:r>
+      <w:r>
+        <w:fldChar w:fldCharType="separate"/>
+      </w:r>
+      <w:r>
+        <w:rPr>
+          <w:noProof/>
+          <w:lang w:val="en-US"/>
+        </w:rPr>
+        <w:t>3</w:t>
+      </w:r>
+      <w:r>
+        <w:fldChar w:fldCharType="end"/>
+      </w:r>
+      <w:r>
+        <w:rPr>
+          <w:lang w:val="en-US"/>
+        </w:rPr>
+        <w:t xml:space="preserve"> - Empirical distribution of ratio y/x. In red is the density of normal law with mean = mean(y/x) and </w:t>
+      </w:r>
+      <w:proofErr w:type="spellStart"/>
+      <w:r>
+        <w:rPr>
+          <w:lang w:val="en-US"/>
+        </w:rPr>
+        <w:t>sd</w:t>
+      </w:r>
+      <w:proofErr w:type="spellEnd"/>
+      <w:r>
+        <w:rPr>
+          <w:lang w:val="en-US"/>
+        </w:rPr>
+        <w:t xml:space="preserve"> = </w:t>
+      </w:r>
+      <w:proofErr w:type="spellStart"/>
+      <w:r>
+        <w:rPr>
+          <w:lang w:val="en-US"/>
+        </w:rPr>
+        <w:t>sd</w:t>
+      </w:r>
+      <w:proofErr w:type="spellEnd"/>
+      <w:r>
+        <w:rPr>
+          <w:lang w:val="en-US"/>
+        </w:rPr>
+        <w:t>(y/x)</w:t>
+      </w:r>
+      <w:r>
+        <w:rPr>
+          <w:noProof/>
+          <w:lang w:val="en-US"/>
+        </w:rPr>
+        <w:t>.</w:t>
+      </w:r>
+      <w:r>
+        <w:rPr>
+          <w:noProof/>
+          <w:lang w:val="en-US"/>
+        </w:rPr>
+        <w:t xml:space="preserve"> N = 10 000</w:t>
+      </w:r>
+    </w:p>
+    <w:p>
+      <w:pPr>
+        <w:rPr>
+          <w:lang w:val="en-US"/>
+        </w:rPr>
+      </w:pPr>
+      <w:r>
+        <w:rPr>
+          <w:highlight w:val="yellow"/>
+          <w:lang w:val="en-US"/>
+        </w:rPr>
+        <w:t>Simulation to check</w:t>
+      </w:r>
+      <w:r>
+        <w:rPr>
+          <w:lang w:val="en-US"/>
+        </w:rPr>
+        <w:t xml:space="preserve"> if mean ratio is on target? </w:t>
+      </w:r>
+    </w:p>
+    <w:p>
+      <w:pPr>
+        <w:ind w:firstLine="851"/>
+        <w:rPr>
+          <w:rFonts w:eastAsiaTheme="minorEastAsia"/>
+          <w:lang w:val="en-US"/>
+        </w:rPr>
+      </w:pPr>
+      <w:r>
+        <w:rPr>
+          <w:lang w:val="en-US"/>
+        </w:rPr>
+        <w:lastRenderedPageBreak/>
+        <w:t>Formally, l</w:t>
+      </w:r>
+      <w:r>
+        <w:rPr>
+          <w:lang w:val="en-US"/>
+        </w:rPr>
+        <w:t xml:space="preserve">et </w:t>
+      </w:r>
+      <m:oMath>
+        <m:d>
+          <m:dPr>
+            <m:ctrlPr>
+              <w:rPr>
+                <w:rFonts w:ascii="Cambria Math" w:hAnsi="Cambria Math"/>
+                <w:i/>
+                <w:lang w:val="en-US"/>
+              </w:rPr>
+            </m:ctrlPr>
+          </m:dPr>
+          <m:e>
+            <m:r>
+              <w:rPr>
+                <w:rFonts w:ascii="Cambria Math" w:hAnsi="Cambria Math"/>
+                <w:lang w:val="en-US"/>
+              </w:rPr>
+              <m:t>x,</m:t>
+            </m:r>
+            <m:r>
+              <w:rPr>
+                <w:rFonts w:ascii="Cambria Math" w:eastAsiaTheme="minorEastAsia" w:hAnsi="Cambria Math"/>
+                <w:lang w:val="en-US"/>
+              </w:rPr>
+              <m:t>y</m:t>
+            </m:r>
+            <m:ctrlPr>
+              <w:rPr>
+                <w:rFonts w:ascii="Cambria Math" w:eastAsiaTheme="minorEastAsia" w:hAnsi="Cambria Math"/>
+                <w:i/>
+                <w:lang w:val="en-US"/>
+              </w:rPr>
+            </m:ctrlPr>
+          </m:e>
+        </m:d>
+        <m:r>
+          <w:rPr>
+            <w:rFonts w:ascii="Cambria Math" w:eastAsiaTheme="minorEastAsia" w:hAnsi="Cambria Math"/>
+            <w:lang w:val="en-US"/>
+          </w:rPr>
+          <m:t>~N(μ,</m:t>
+        </m:r>
+        <m:sSup>
+          <m:sSupPr>
+            <m:ctrlPr>
+              <w:rPr>
+                <w:rFonts w:ascii="Cambria Math" w:eastAsiaTheme="minorEastAsia" w:hAnsi="Cambria Math"/>
+                <w:i/>
+                <w:lang w:val="en-US"/>
+              </w:rPr>
+            </m:ctrlPr>
+          </m:sSupPr>
+          <m:e>
+            <m:r>
+              <m:rPr>
+                <m:sty m:val="p"/>
+              </m:rPr>
+              <w:rPr>
+                <w:rFonts w:ascii="Cambria Math" w:eastAsiaTheme="minorEastAsia" w:hAnsi="Cambria Math"/>
+                <w:lang w:val="en-US"/>
+              </w:rPr>
+              <m:t>Σ</m:t>
+            </m:r>
+          </m:e>
+          <m:sup>
+            <m:r>
+              <w:rPr>
+                <w:rFonts w:ascii="Cambria Math" w:eastAsiaTheme="minorEastAsia" w:hAnsi="Cambria Math"/>
+                <w:lang w:val="en-US"/>
+              </w:rPr>
+              <m:t>2</m:t>
+            </m:r>
+          </m:sup>
+        </m:sSup>
+        <m:r>
+          <w:rPr>
+            <w:rFonts w:ascii="Cambria Math" w:eastAsiaTheme="minorEastAsia" w:hAnsi="Cambria Math"/>
+            <w:lang w:val="en-US"/>
+          </w:rPr>
+          <m:t>)</m:t>
+        </m:r>
+      </m:oMath>
+      <w:r>
+        <w:rPr>
+          <w:rFonts w:eastAsiaTheme="minorEastAsia"/>
+          <w:lang w:val="en-US"/>
+        </w:rPr>
+        <w:t xml:space="preserve"> be a random 2d real vector, with </w:t>
+      </w:r>
+      <m:oMath>
+        <m:r>
+          <w:rPr>
+            <w:rFonts w:ascii="Cambria Math" w:eastAsiaTheme="minorEastAsia" w:hAnsi="Cambria Math"/>
+            <w:lang w:val="en-US"/>
+          </w:rPr>
+          <m:t>μ=(</m:t>
+        </m:r>
+        <m:sSub>
+          <m:sSubPr>
+            <m:ctrlPr>
+              <w:rPr>
+                <w:rFonts w:ascii="Cambria Math" w:eastAsiaTheme="minorEastAsia" w:hAnsi="Cambria Math"/>
+                <w:i/>
+                <w:lang w:val="en-US"/>
+              </w:rPr>
+            </m:ctrlPr>
+          </m:sSubPr>
+          <m:e>
+            <m:r>
+              <w:rPr>
+                <w:rFonts w:ascii="Cambria Math" w:eastAsiaTheme="minorEastAsia" w:hAnsi="Cambria Math"/>
+                <w:lang w:val="en-US"/>
+              </w:rPr>
+              <m:t>μ</m:t>
+            </m:r>
+          </m:e>
+          <m:sub>
+            <m:r>
+              <w:rPr>
+                <w:rFonts w:ascii="Cambria Math" w:eastAsiaTheme="minorEastAsia" w:hAnsi="Cambria Math"/>
+                <w:lang w:val="en-US"/>
+              </w:rPr>
+              <m:t>X</m:t>
+            </m:r>
+          </m:sub>
+        </m:sSub>
+        <m:r>
+          <w:rPr>
+            <w:rFonts w:ascii="Cambria Math" w:eastAsiaTheme="minorEastAsia" w:hAnsi="Cambria Math"/>
+            <w:lang w:val="en-US"/>
+          </w:rPr>
+          <m:t>,</m:t>
+        </m:r>
+        <m:sSub>
+          <m:sSubPr>
+            <m:ctrlPr>
+              <w:rPr>
+                <w:rFonts w:ascii="Cambria Math" w:eastAsiaTheme="minorEastAsia" w:hAnsi="Cambria Math"/>
+                <w:i/>
+                <w:lang w:val="en-US"/>
+              </w:rPr>
+            </m:ctrlPr>
+          </m:sSubPr>
+          <m:e>
+            <m:r>
+              <w:rPr>
+                <w:rFonts w:ascii="Cambria Math" w:eastAsiaTheme="minorEastAsia" w:hAnsi="Cambria Math"/>
+                <w:lang w:val="en-US"/>
+              </w:rPr>
+              <m:t>μ</m:t>
+            </m:r>
+          </m:e>
+          <m:sub>
+            <m:r>
+              <w:rPr>
+                <w:rFonts w:ascii="Cambria Math" w:eastAsiaTheme="minorEastAsia" w:hAnsi="Cambria Math"/>
+                <w:lang w:val="en-US"/>
+              </w:rPr>
+              <m:t>Y</m:t>
+            </m:r>
+          </m:sub>
+        </m:sSub>
+        <m:r>
+          <w:rPr>
+            <w:rFonts w:ascii="Cambria Math" w:eastAsiaTheme="minorEastAsia" w:hAnsi="Cambria Math"/>
+            <w:lang w:val="en-US"/>
+          </w:rPr>
+          <m:t>)</m:t>
+        </m:r>
+      </m:oMath>
+      <w:r>
+        <w:rPr>
+          <w:rFonts w:eastAsiaTheme="minorEastAsia"/>
+          <w:lang w:val="en-US"/>
+        </w:rPr>
+        <w:t xml:space="preserve"> the vector of means and </w:t>
+      </w:r>
+      <m:oMath>
+        <m:sSup>
+          <m:sSupPr>
+            <m:ctrlPr>
+              <w:rPr>
+                <w:rFonts w:ascii="Cambria Math" w:eastAsiaTheme="minorEastAsia" w:hAnsi="Cambria Math"/>
+                <w:i/>
+                <w:lang w:val="en-US"/>
+              </w:rPr>
+            </m:ctrlPr>
+          </m:sSupPr>
+          <m:e>
+            <m:r>
+              <m:rPr>
+                <m:sty m:val="p"/>
+              </m:rPr>
+              <w:rPr>
+                <w:rFonts w:ascii="Cambria Math" w:eastAsiaTheme="minorEastAsia" w:hAnsi="Cambria Math"/>
+                <w:lang w:val="en-US"/>
+              </w:rPr>
+              <m:t>Σ</m:t>
+            </m:r>
+            <m:ctrlPr>
+              <w:rPr>
+                <w:rFonts w:ascii="Cambria Math" w:eastAsiaTheme="minorEastAsia" w:hAnsi="Cambria Math"/>
+                <w:lang w:val="en-US"/>
+              </w:rPr>
+            </m:ctrlPr>
+          </m:e>
+          <m:sup>
+            <m:r>
+              <w:rPr>
+                <w:rFonts w:ascii="Cambria Math" w:eastAsiaTheme="minorEastAsia" w:hAnsi="Cambria Math"/>
+                <w:lang w:val="en-US"/>
+              </w:rPr>
+              <m:t>2</m:t>
+            </m:r>
+          </m:sup>
+        </m:sSup>
+        <m:r>
+          <w:rPr>
+            <w:rFonts w:ascii="Cambria Math" w:eastAsiaTheme="minorEastAsia" w:hAnsi="Cambria Math"/>
+            <w:lang w:val="en-US"/>
+          </w:rPr>
+          <m:t>=</m:t>
+        </m:r>
+        <m:d>
+          <m:dPr>
+            <m:ctrlPr>
+              <w:rPr>
+                <w:rFonts w:ascii="Cambria Math" w:eastAsiaTheme="minorEastAsia" w:hAnsi="Cambria Math"/>
+                <w:i/>
+                <w:lang w:val="en-US"/>
+              </w:rPr>
+            </m:ctrlPr>
+          </m:dPr>
+          <m:e>
+            <m:m>
+              <m:mPr>
+                <m:mcs>
+                  <m:mc>
+                    <m:mcPr>
+                      <m:count m:val="2"/>
+                      <m:mcJc m:val="center"/>
+                    </m:mcPr>
+                  </m:mc>
+                </m:mcs>
+                <m:ctrlPr>
+                  <w:rPr>
+                    <w:rFonts w:ascii="Cambria Math" w:eastAsiaTheme="minorEastAsia" w:hAnsi="Cambria Math"/>
+                    <w:i/>
+                    <w:lang w:val="en-US"/>
+                  </w:rPr>
+                </m:ctrlPr>
+              </m:mPr>
+              <m:mr>
+                <m:e>
+                  <m:sSubSup>
+                    <m:sSubSupPr>
+                      <m:ctrlPr>
+                        <w:rPr>
+                          <w:rFonts w:ascii="Cambria Math" w:eastAsiaTheme="minorEastAsia" w:hAnsi="Cambria Math"/>
+                          <w:i/>
+                          <w:lang w:val="en-US"/>
+                        </w:rPr>
+                      </m:ctrlPr>
+                    </m:sSubSupPr>
+                    <m:e>
+                      <m:r>
+                        <w:rPr>
+                          <w:rFonts w:ascii="Cambria Math" w:eastAsiaTheme="minorEastAsia" w:hAnsi="Cambria Math"/>
+                          <w:lang w:val="en-US"/>
+                        </w:rPr>
+                        <m:t>σ</m:t>
+                      </m:r>
+                    </m:e>
+                    <m:sub>
+                      <m:r>
+                        <w:rPr>
+                          <w:rFonts w:ascii="Cambria Math" w:eastAsiaTheme="minorEastAsia" w:hAnsi="Cambria Math"/>
+                          <w:lang w:val="en-US"/>
+                        </w:rPr>
+                        <m:t>X</m:t>
+                      </m:r>
+                    </m:sub>
+                    <m:sup>
+                      <m:r>
+                        <w:rPr>
+                          <w:rFonts w:ascii="Cambria Math" w:eastAsiaTheme="minorEastAsia" w:hAnsi="Cambria Math"/>
+                          <w:lang w:val="en-US"/>
+                        </w:rPr>
+                        <m:t>2</m:t>
+                      </m:r>
+                    </m:sup>
+                  </m:sSubSup>
+                </m:e>
+                <m:e>
+                  <m:r>
+                    <w:rPr>
+                      <w:rFonts w:ascii="Cambria Math" w:eastAsiaTheme="minorEastAsia" w:hAnsi="Cambria Math"/>
+                      <w:lang w:val="en-US"/>
+                    </w:rPr>
+                    <m:t>ρ</m:t>
+                  </m:r>
+                  <m:sSub>
+                    <m:sSubPr>
+                      <m:ctrlPr>
+                        <w:rPr>
+                          <w:rFonts w:ascii="Cambria Math" w:eastAsiaTheme="minorEastAsia" w:hAnsi="Cambria Math"/>
+                          <w:i/>
+                          <w:lang w:val="en-US"/>
+                        </w:rPr>
+                      </m:ctrlPr>
+                    </m:sSubPr>
+                    <m:e>
+                      <m:r>
+                        <w:rPr>
+                          <w:rFonts w:ascii="Cambria Math" w:eastAsiaTheme="minorEastAsia" w:hAnsi="Cambria Math"/>
+                          <w:lang w:val="en-US"/>
+                        </w:rPr>
+                        <m:t>σ</m:t>
+                      </m:r>
+                    </m:e>
+                    <m:sub>
+                      <m:r>
+                        <w:rPr>
+                          <w:rFonts w:ascii="Cambria Math" w:eastAsiaTheme="minorEastAsia" w:hAnsi="Cambria Math"/>
+                          <w:lang w:val="en-US"/>
+                        </w:rPr>
+                        <m:t>X</m:t>
+                      </m:r>
+                    </m:sub>
+                  </m:sSub>
+                  <m:sSub>
+                    <m:sSubPr>
+                      <m:ctrlPr>
+                        <w:rPr>
+                          <w:rFonts w:ascii="Cambria Math" w:eastAsiaTheme="minorEastAsia" w:hAnsi="Cambria Math"/>
+                          <w:i/>
+                          <w:lang w:val="en-US"/>
+                        </w:rPr>
+                      </m:ctrlPr>
+                    </m:sSubPr>
+                    <m:e>
+                      <m:r>
+                        <w:rPr>
+                          <w:rFonts w:ascii="Cambria Math" w:eastAsiaTheme="minorEastAsia" w:hAnsi="Cambria Math"/>
+                          <w:lang w:val="en-US"/>
+                        </w:rPr>
+                        <m:t>σ</m:t>
+                      </m:r>
+                    </m:e>
+                    <m:sub>
+                      <m:r>
+                        <w:rPr>
+                          <w:rFonts w:ascii="Cambria Math" w:eastAsiaTheme="minorEastAsia" w:hAnsi="Cambria Math"/>
+                          <w:lang w:val="en-US"/>
+                        </w:rPr>
+                        <m:t>Y</m:t>
+                      </m:r>
+                    </m:sub>
+                  </m:sSub>
+                </m:e>
+              </m:mr>
+              <m:mr>
+                <m:e>
+                  <m:r>
+                    <w:rPr>
+                      <w:rFonts w:ascii="Cambria Math" w:eastAsiaTheme="minorEastAsia" w:hAnsi="Cambria Math"/>
+                      <w:lang w:val="en-US"/>
+                    </w:rPr>
+                    <m:t>ρ</m:t>
+                  </m:r>
+                  <m:sSub>
+                    <m:sSubPr>
+                      <m:ctrlPr>
+                        <w:rPr>
+                          <w:rFonts w:ascii="Cambria Math" w:eastAsiaTheme="minorEastAsia" w:hAnsi="Cambria Math"/>
+                          <w:i/>
+                          <w:lang w:val="en-US"/>
+                        </w:rPr>
+                      </m:ctrlPr>
+                    </m:sSubPr>
+                    <m:e>
+                      <m:r>
+                        <w:rPr>
+                          <w:rFonts w:ascii="Cambria Math" w:eastAsiaTheme="minorEastAsia" w:hAnsi="Cambria Math"/>
+                          <w:lang w:val="en-US"/>
+                        </w:rPr>
+                        <m:t>σ</m:t>
+                      </m:r>
+                    </m:e>
+                    <m:sub>
+                      <m:r>
+                        <w:rPr>
+                          <w:rFonts w:ascii="Cambria Math" w:eastAsiaTheme="minorEastAsia" w:hAnsi="Cambria Math"/>
+                          <w:lang w:val="en-US"/>
+                        </w:rPr>
+                        <m:t>X</m:t>
+                      </m:r>
+                    </m:sub>
+                  </m:sSub>
+                  <m:sSub>
+                    <m:sSubPr>
+                      <m:ctrlPr>
+                        <w:rPr>
+                          <w:rFonts w:ascii="Cambria Math" w:eastAsiaTheme="minorEastAsia" w:hAnsi="Cambria Math"/>
+                          <w:i/>
+                          <w:lang w:val="en-US"/>
+                        </w:rPr>
+                      </m:ctrlPr>
+                    </m:sSubPr>
+                    <m:e>
+                      <m:r>
+                        <w:rPr>
+                          <w:rFonts w:ascii="Cambria Math" w:eastAsiaTheme="minorEastAsia" w:hAnsi="Cambria Math"/>
+                          <w:lang w:val="en-US"/>
+                        </w:rPr>
+                        <m:t>σ</m:t>
+                      </m:r>
+                    </m:e>
+                    <m:sub>
+                      <m:r>
+                        <w:rPr>
+                          <w:rFonts w:ascii="Cambria Math" w:eastAsiaTheme="minorEastAsia" w:hAnsi="Cambria Math"/>
+                          <w:lang w:val="en-US"/>
+                        </w:rPr>
+                        <m:t>Y</m:t>
+                      </m:r>
+                    </m:sub>
+                  </m:sSub>
+                </m:e>
+                <m:e>
+                  <m:sSubSup>
+                    <m:sSubSupPr>
+                      <m:ctrlPr>
+                        <w:rPr>
+                          <w:rFonts w:ascii="Cambria Math" w:eastAsiaTheme="minorEastAsia" w:hAnsi="Cambria Math"/>
+                          <w:i/>
+                          <w:lang w:val="en-US"/>
+                        </w:rPr>
+                      </m:ctrlPr>
+                    </m:sSubSupPr>
+                    <m:e>
+                      <m:r>
+                        <w:rPr>
+                          <w:rFonts w:ascii="Cambria Math" w:eastAsiaTheme="minorEastAsia" w:hAnsi="Cambria Math"/>
+                          <w:lang w:val="en-US"/>
+                        </w:rPr>
+                        <m:t>σ</m:t>
+                      </m:r>
+                    </m:e>
+                    <m:sub>
+                      <m:r>
+                        <w:rPr>
+                          <w:rFonts w:ascii="Cambria Math" w:eastAsiaTheme="minorEastAsia" w:hAnsi="Cambria Math"/>
+                          <w:lang w:val="en-US"/>
+                        </w:rPr>
+                        <m:t>Y</m:t>
+                      </m:r>
+                    </m:sub>
+                    <m:sup>
+                      <m:r>
+                        <w:rPr>
+                          <w:rFonts w:ascii="Cambria Math" w:eastAsiaTheme="minorEastAsia" w:hAnsi="Cambria Math"/>
+                          <w:lang w:val="en-US"/>
+                        </w:rPr>
+                        <m:t>2</m:t>
+                      </m:r>
+                    </m:sup>
+                  </m:sSubSup>
+                </m:e>
+              </m:mr>
+            </m:m>
+          </m:e>
+        </m:d>
+      </m:oMath>
+      <w:r>
+        <w:rPr>
+          <w:rFonts w:eastAsiaTheme="minorEastAsia"/>
+          <w:lang w:val="en-US"/>
+        </w:rPr>
+        <w:t xml:space="preserve"> the variance-covariance matrix, with </w:t>
+      </w:r>
+      <m:oMath>
+        <m:r>
+          <w:rPr>
+            <w:rFonts w:ascii="Cambria Math" w:eastAsiaTheme="minorEastAsia" w:hAnsi="Cambria Math"/>
+            <w:lang w:val="en-US"/>
+          </w:rPr>
+          <m:t>ρ∈[-1,1]</m:t>
+        </m:r>
+      </m:oMath>
+      <w:r>
+        <w:rPr>
+          <w:rFonts w:eastAsiaTheme="minorEastAsia"/>
+          <w:lang w:val="en-US"/>
+        </w:rPr>
+        <w:t xml:space="preserve"> the correlation between x and y.</w:t>
+      </w:r>
+      <w:r>
+        <w:rPr>
+          <w:rFonts w:eastAsiaTheme="minorEastAsia"/>
+          <w:lang w:val="en-US"/>
+        </w:rPr>
+        <w:t xml:space="preserve"> For a given correlation</w:t>
+      </w:r>
+      <w:r>
+        <w:rPr>
+          <w:rFonts w:eastAsiaTheme="minorEastAsia"/>
+          <w:lang w:val="en-US"/>
+        </w:rPr>
+        <w:t xml:space="preserve"> </w:t>
+      </w:r>
+      <m:oMath>
+        <m:r>
+          <w:rPr>
+            <w:rFonts w:ascii="Cambria Math" w:eastAsiaTheme="minorEastAsia" w:hAnsi="Cambria Math"/>
+            <w:lang w:val="en-US"/>
+          </w:rPr>
+          <m:t>ρ</m:t>
+        </m:r>
+      </m:oMath>
+      <w:r>
+        <w:rPr>
+          <w:rFonts w:eastAsiaTheme="minorEastAsia"/>
+          <w:lang w:val="en-US"/>
+        </w:rPr>
+        <w:t xml:space="preserve"> and x value, we know the Best Linear Unbiased Predictor (BLUP) of y is:</w:t>
+      </w:r>
+    </w:p>
+    <w:p>
+      <w:pPr>
+        <w:jc w:val="center"/>
+        <w:rPr>
+          <w:rFonts w:eastAsiaTheme="minorEastAsia"/>
+          <w:lang w:val="en-US"/>
+        </w:rPr>
+      </w:pPr>
+      <m:oMathPara>
+        <m:oMath>
+          <m:r>
+            <w:rPr>
+              <w:rFonts w:ascii="Cambria Math" w:eastAsiaTheme="minorEastAsia" w:hAnsi="Cambria Math"/>
+              <w:lang w:val="en-US"/>
+            </w:rPr>
+            <m:t>y</m:t>
+          </m:r>
+          <m:d>
+            <m:dPr>
+              <m:ctrlPr>
+                <w:rPr>
+                  <w:rFonts w:ascii="Cambria Math" w:eastAsiaTheme="minorEastAsia" w:hAnsi="Cambria Math"/>
+                  <w:i/>
+                  <w:lang w:val="en-US"/>
+                </w:rPr>
+              </m:ctrlPr>
+            </m:dPr>
+            <m:e>
+              <m:r>
+                <w:rPr>
+                  <w:rFonts w:ascii="Cambria Math" w:eastAsiaTheme="minorEastAsia" w:hAnsi="Cambria Math"/>
+                  <w:lang w:val="en-US"/>
+                </w:rPr>
+                <m:t>x</m:t>
+              </m:r>
+            </m:e>
+          </m:d>
+          <m:r>
+            <w:rPr>
+              <w:rFonts w:ascii="Cambria Math" w:eastAsiaTheme="minorEastAsia" w:hAnsi="Cambria Math"/>
+              <w:lang w:val="en-US"/>
+            </w:rPr>
+            <m:t>=ρ</m:t>
+          </m:r>
+          <m:f>
+            <m:fPr>
+              <m:ctrlPr>
+                <w:rPr>
+                  <w:rFonts w:ascii="Cambria Math" w:eastAsiaTheme="minorEastAsia" w:hAnsi="Cambria Math"/>
+                  <w:i/>
+                  <w:lang w:val="en-US"/>
+                </w:rPr>
+              </m:ctrlPr>
+            </m:fPr>
+            <m:num>
+              <m:sSub>
+                <m:sSubPr>
+                  <m:ctrlPr>
+                    <w:rPr>
+                      <w:rFonts w:ascii="Cambria Math" w:eastAsiaTheme="minorEastAsia" w:hAnsi="Cambria Math"/>
+                      <w:i/>
+                      <w:lang w:val="en-US"/>
+                    </w:rPr>
+                  </m:ctrlPr>
+                </m:sSubPr>
+                <m:e>
+                  <m:r>
+                    <w:rPr>
+                      <w:rFonts w:ascii="Cambria Math" w:eastAsiaTheme="minorEastAsia" w:hAnsi="Cambria Math"/>
+                      <w:lang w:val="en-US"/>
+                    </w:rPr>
+                    <m:t>σ</m:t>
+                  </m:r>
+                </m:e>
+                <m:sub>
+                  <m:r>
+                    <w:rPr>
+                      <w:rFonts w:ascii="Cambria Math" w:eastAsiaTheme="minorEastAsia" w:hAnsi="Cambria Math"/>
+                      <w:lang w:val="en-US"/>
+                    </w:rPr>
+                    <m:t>Y</m:t>
+                  </m:r>
+                </m:sub>
+              </m:sSub>
+            </m:num>
+            <m:den>
+              <m:sSub>
+                <m:sSubPr>
+                  <m:ctrlPr>
+                    <w:rPr>
+                      <w:rFonts w:ascii="Cambria Math" w:eastAsiaTheme="minorEastAsia" w:hAnsi="Cambria Math"/>
+                      <w:i/>
+                      <w:lang w:val="en-US"/>
+                    </w:rPr>
+                  </m:ctrlPr>
+                </m:sSubPr>
+                <m:e>
+                  <m:r>
+                    <w:rPr>
+                      <w:rFonts w:ascii="Cambria Math" w:eastAsiaTheme="minorEastAsia" w:hAnsi="Cambria Math"/>
+                      <w:lang w:val="en-US"/>
+                    </w:rPr>
+                    <m:t>σ</m:t>
+                  </m:r>
+                </m:e>
+                <m:sub>
+                  <m:r>
+                    <w:rPr>
+                      <w:rFonts w:ascii="Cambria Math" w:eastAsiaTheme="minorEastAsia" w:hAnsi="Cambria Math"/>
+                      <w:lang w:val="en-US"/>
+                    </w:rPr>
+                    <m:t>X</m:t>
+                  </m:r>
+                </m:sub>
+              </m:sSub>
+            </m:den>
+          </m:f>
+          <m:d>
+            <m:dPr>
+              <m:ctrlPr>
+                <w:rPr>
+                  <w:rFonts w:ascii="Cambria Math" w:eastAsiaTheme="minorEastAsia" w:hAnsi="Cambria Math"/>
+                  <w:i/>
+                  <w:lang w:val="en-US"/>
+                </w:rPr>
+              </m:ctrlPr>
+            </m:dPr>
+            <m:e>
+              <m:r>
+                <w:rPr>
+                  <w:rFonts w:ascii="Cambria Math" w:eastAsiaTheme="minorEastAsia" w:hAnsi="Cambria Math"/>
+                  <w:lang w:val="en-US"/>
+                </w:rPr>
+                <m:t>x-</m:t>
+              </m:r>
+              <m:sSub>
+                <m:sSubPr>
+                  <m:ctrlPr>
+                    <w:rPr>
+                      <w:rFonts w:ascii="Cambria Math" w:eastAsiaTheme="minorEastAsia" w:hAnsi="Cambria Math"/>
+                      <w:i/>
+                      <w:lang w:val="en-US"/>
+                    </w:rPr>
+                  </m:ctrlPr>
+                </m:sSubPr>
+                <m:e>
+                  <m:r>
+                    <w:rPr>
+                      <w:rFonts w:ascii="Cambria Math" w:eastAsiaTheme="minorEastAsia" w:hAnsi="Cambria Math"/>
+                      <w:lang w:val="en-US"/>
+                    </w:rPr>
+                    <m:t>μ</m:t>
+                  </m:r>
+                </m:e>
+                <m:sub>
+                  <m:r>
+                    <w:rPr>
+                      <w:rFonts w:ascii="Cambria Math" w:eastAsiaTheme="minorEastAsia" w:hAnsi="Cambria Math"/>
+                      <w:lang w:val="en-US"/>
+                    </w:rPr>
+                    <m:t>X</m:t>
+                  </m:r>
+                </m:sub>
+              </m:sSub>
+            </m:e>
+          </m:d>
+          <m:r>
+            <w:rPr>
+              <w:rFonts w:ascii="Cambria Math" w:eastAsiaTheme="minorEastAsia" w:hAnsi="Cambria Math"/>
+              <w:lang w:val="en-US"/>
+            </w:rPr>
+            <m:t>+</m:t>
+          </m:r>
+          <m:sSub>
+            <m:sSubPr>
+              <m:ctrlPr>
+                <w:rPr>
+                  <w:rFonts w:ascii="Cambria Math" w:eastAsiaTheme="minorEastAsia" w:hAnsi="Cambria Math"/>
+                  <w:i/>
+                  <w:lang w:val="en-US"/>
+                </w:rPr>
+              </m:ctrlPr>
+            </m:sSubPr>
+            <m:e>
+              <m:r>
+                <w:rPr>
+                  <w:rFonts w:ascii="Cambria Math" w:eastAsiaTheme="minorEastAsia" w:hAnsi="Cambria Math"/>
+                  <w:lang w:val="en-US"/>
+                </w:rPr>
+                <m:t>μ</m:t>
+              </m:r>
+            </m:e>
+            <m:sub>
+              <m:r>
+                <w:rPr>
+                  <w:rFonts w:ascii="Cambria Math" w:eastAsiaTheme="minorEastAsia" w:hAnsi="Cambria Math"/>
+                  <w:lang w:val="en-US"/>
+                </w:rPr>
+                <m:t>Y</m:t>
+              </m:r>
+            </m:sub>
+          </m:sSub>
+        </m:oMath>
+      </m:oMathPara>
+    </w:p>
+    <w:p>
+      <w:pPr>
+        <w:ind w:firstLine="851"/>
+        <w:rPr>
+          <w:rFonts w:eastAsiaTheme="minorEastAsia"/>
+          <w:lang w:val="en-US"/>
+        </w:rPr>
+      </w:pPr>
+      <w:r>
+        <w:rPr>
+          <w:lang w:val="en-US"/>
+        </w:rPr>
+        <w:t xml:space="preserve">We can adjust the correlation coefficient accordingly so that </w:t>
+      </w:r>
+      <m:oMath>
+        <m:r>
+          <w:rPr>
+            <w:rFonts w:ascii="Cambria Math" w:eastAsiaTheme="minorEastAsia" w:hAnsi="Cambria Math"/>
+            <w:lang w:val="en-US"/>
+          </w:rPr>
+          <m:t>ρ</m:t>
+        </m:r>
+        <m:f>
+          <m:fPr>
+            <m:ctrlPr>
+              <w:rPr>
+                <w:rFonts w:ascii="Cambria Math" w:eastAsiaTheme="minorEastAsia" w:hAnsi="Cambria Math"/>
+                <w:i/>
+                <w:lang w:val="en-US"/>
+              </w:rPr>
+            </m:ctrlPr>
+          </m:fPr>
+          <m:num>
+            <m:sSub>
+              <m:sSubPr>
+                <m:ctrlPr>
+                  <w:rPr>
+                    <w:rFonts w:ascii="Cambria Math" w:eastAsiaTheme="minorEastAsia" w:hAnsi="Cambria Math"/>
+                    <w:i/>
+                    <w:lang w:val="en-US"/>
+                  </w:rPr>
+                </m:ctrlPr>
+              </m:sSubPr>
+              <m:e>
+                <m:r>
+                  <w:rPr>
+                    <w:rFonts w:ascii="Cambria Math" w:eastAsiaTheme="minorEastAsia" w:hAnsi="Cambria Math"/>
+                    <w:lang w:val="en-US"/>
+                  </w:rPr>
+                  <m:t>σ</m:t>
+                </m:r>
+              </m:e>
+              <m:sub>
+                <m:r>
+                  <w:rPr>
+                    <w:rFonts w:ascii="Cambria Math" w:eastAsiaTheme="minorEastAsia" w:hAnsi="Cambria Math"/>
+                    <w:lang w:val="en-US"/>
+                  </w:rPr>
+                  <m:t>Y</m:t>
+                </m:r>
+              </m:sub>
+            </m:sSub>
+          </m:num>
+          <m:den>
+            <m:sSub>
+              <m:sSubPr>
+                <m:ctrlPr>
+                  <w:rPr>
+                    <w:rFonts w:ascii="Cambria Math" w:eastAsiaTheme="minorEastAsia" w:hAnsi="Cambria Math"/>
+                    <w:i/>
+                    <w:lang w:val="en-US"/>
+                  </w:rPr>
+                </m:ctrlPr>
+              </m:sSubPr>
+              <m:e>
+                <m:r>
+                  <w:rPr>
+                    <w:rFonts w:ascii="Cambria Math" w:eastAsiaTheme="minorEastAsia" w:hAnsi="Cambria Math"/>
+                    <w:lang w:val="en-US"/>
+                  </w:rPr>
+                  <m:t>σ</m:t>
+                </m:r>
+              </m:e>
+              <m:sub>
+                <m:r>
+                  <w:rPr>
+                    <w:rFonts w:ascii="Cambria Math" w:eastAsiaTheme="minorEastAsia" w:hAnsi="Cambria Math"/>
+                    <w:lang w:val="en-US"/>
+                  </w:rPr>
+                  <m:t>X</m:t>
+                </m:r>
+              </m:sub>
+            </m:sSub>
+          </m:den>
+        </m:f>
+        <m:r>
+          <w:rPr>
+            <w:rFonts w:ascii="Cambria Math" w:eastAsiaTheme="minorEastAsia" w:hAnsi="Cambria Math"/>
+            <w:lang w:val="en-US"/>
+          </w:rPr>
+          <m:t>=</m:t>
+        </m:r>
+        <m:sSub>
+          <m:sSubPr>
+            <m:ctrlPr>
+              <w:rPr>
+                <w:rFonts w:ascii="Cambria Math" w:eastAsiaTheme="minorEastAsia" w:hAnsi="Cambria Math"/>
+                <w:i/>
+                <w:lang w:val="en-US"/>
+              </w:rPr>
+            </m:ctrlPr>
+          </m:sSubPr>
+          <m:e>
+            <m:r>
+              <w:rPr>
+                <w:rFonts w:ascii="Cambria Math" w:eastAsiaTheme="minorEastAsia" w:hAnsi="Cambria Math"/>
+                <w:lang w:val="en-US"/>
+              </w:rPr>
+              <m:t>β</m:t>
+            </m:r>
+          </m:e>
+          <m:sub>
+            <m:r>
+              <w:rPr>
+                <w:rFonts w:ascii="Cambria Math" w:eastAsiaTheme="minorEastAsia" w:hAnsi="Cambria Math"/>
+                <w:lang w:val="en-US"/>
+              </w:rPr>
+              <m:t>onset</m:t>
+            </m:r>
+          </m:sub>
+        </m:sSub>
+      </m:oMath>
+      <w:r>
+        <w:rPr>
+          <w:rFonts w:eastAsiaTheme="minorEastAsia"/>
+          <w:lang w:val="en-US"/>
+        </w:rPr>
+        <w:t xml:space="preserve">. </w:t>
+      </w:r>
+      <w:r>
+        <w:rPr>
+          <w:rFonts w:eastAsiaTheme="minorEastAsia"/>
+          <w:lang w:val="en-US"/>
+        </w:rPr>
+        <w:t xml:space="preserve">This way the ratio </w:t>
+      </w:r>
+      <m:oMath>
+        <m:f>
+          <m:fPr>
+            <m:ctrlPr>
+              <w:rPr>
+                <w:rFonts w:ascii="Cambria Math" w:eastAsiaTheme="minorEastAsia" w:hAnsi="Cambria Math"/>
+                <w:i/>
+                <w:lang w:val="en-US"/>
+              </w:rPr>
+            </m:ctrlPr>
+          </m:fPr>
+          <m:num>
+            <m:r>
+              <w:rPr>
+                <w:rFonts w:ascii="Cambria Math" w:eastAsiaTheme="minorEastAsia" w:hAnsi="Cambria Math"/>
+                <w:lang w:val="en-US"/>
+              </w:rPr>
+              <m:t>y</m:t>
+            </m:r>
+          </m:num>
+          <m:den>
+            <m:r>
+              <w:rPr>
+                <w:rFonts w:ascii="Cambria Math" w:eastAsiaTheme="minorEastAsia" w:hAnsi="Cambria Math"/>
+                <w:lang w:val="en-US"/>
+              </w:rPr>
+              <m:t>x</m:t>
+            </m:r>
+          </m:den>
+        </m:f>
+      </m:oMath>
+      <w:r>
+        <w:rPr>
+          <w:rFonts w:eastAsiaTheme="minorEastAsia"/>
+          <w:lang w:val="en-US"/>
+        </w:rPr>
+        <w:t xml:space="preserve"> would average the desired value. </w:t>
+      </w:r>
+      <w:r>
+        <w:rPr>
+          <w:rFonts w:eastAsiaTheme="minorEastAsia"/>
+          <w:lang w:val="en-US"/>
+        </w:rPr>
+        <w:t xml:space="preserve">However, the correlation coefficient </w:t>
+      </w:r>
+      <m:oMath>
+        <m:r>
+          <w:rPr>
+            <w:rFonts w:ascii="Cambria Math" w:eastAsiaTheme="minorEastAsia" w:hAnsi="Cambria Math"/>
+            <w:lang w:val="en-US"/>
+          </w:rPr>
+          <m:t>ρ</m:t>
+        </m:r>
+      </m:oMath>
+      <w:r>
+        <w:rPr>
+          <w:rFonts w:eastAsiaTheme="minorEastAsia"/>
+          <w:lang w:val="en-US"/>
+        </w:rPr>
+        <w:t xml:space="preserve"> is bounded, so it yields the following condition</w:t>
+      </w:r>
+      <w:r>
+        <w:rPr>
+          <w:rFonts w:eastAsiaTheme="minorEastAsia"/>
+          <w:lang w:val="en-US"/>
+        </w:rPr>
+        <w:t xml:space="preserve"> on the ratio of individual standard deviations</w:t>
+      </w:r>
+      <w:r>
+        <w:rPr>
+          <w:rFonts w:eastAsiaTheme="minorEastAsia"/>
+          <w:lang w:val="en-US"/>
+        </w:rPr>
+        <w:t>:</w:t>
+      </w:r>
+    </w:p>
+    <w:p>
+      <w:pPr>
+        <w:ind w:firstLine="851"/>
+        <w:jc w:val="center"/>
+        <w:rPr>
+          <w:lang w:val="en-US"/>
+        </w:rPr>
+      </w:pPr>
+      <m:oMathPara>
+        <m:oMath>
+          <m:r>
+            <w:rPr>
+              <w:rFonts w:ascii="Cambria Math" w:hAnsi="Cambria Math"/>
+              <w:lang w:val="en-US"/>
+            </w:rPr>
+            <m:t>-1&lt;ρ&lt;1</m:t>
+          </m:r>
+          <m:r>
+            <m:rPr>
+              <m:sty m:val="bi"/>
+            </m:rPr>
+            <w:rPr>
+              <w:rFonts w:ascii="Cambria Math" w:hAnsi="Cambria Math"/>
+            </w:rPr>
+            <m:t>⇔ -</m:t>
+          </m:r>
+          <m:f>
+            <m:fPr>
+              <m:ctrlPr>
+                <w:rPr>
+                  <w:rFonts w:ascii="Cambria Math" w:eastAsiaTheme="minorEastAsia" w:hAnsi="Cambria Math"/>
+                  <w:i/>
+                  <w:lang w:val="en-US"/>
+                </w:rPr>
+              </m:ctrlPr>
+            </m:fPr>
+            <m:num>
+              <m:sSub>
+                <m:sSubPr>
+                  <m:ctrlPr>
+                    <w:rPr>
+                      <w:rFonts w:ascii="Cambria Math" w:eastAsiaTheme="minorEastAsia" w:hAnsi="Cambria Math"/>
+                      <w:i/>
+                      <w:lang w:val="en-US"/>
+                    </w:rPr>
+                  </m:ctrlPr>
+                </m:sSubPr>
+                <m:e>
+                  <m:r>
+                    <w:rPr>
+                      <w:rFonts w:ascii="Cambria Math" w:eastAsiaTheme="minorEastAsia" w:hAnsi="Cambria Math"/>
+                      <w:lang w:val="en-US"/>
+                    </w:rPr>
+                    <m:t>σ</m:t>
+                  </m:r>
+                </m:e>
+                <m:sub>
+                  <m:r>
+                    <w:rPr>
+                      <w:rFonts w:ascii="Cambria Math" w:eastAsiaTheme="minorEastAsia" w:hAnsi="Cambria Math"/>
+                      <w:lang w:val="en-US"/>
+                    </w:rPr>
+                    <m:t>Y</m:t>
+                  </m:r>
+                </m:sub>
+              </m:sSub>
+            </m:num>
+            <m:den>
+              <m:sSub>
+                <m:sSubPr>
+                  <m:ctrlPr>
+                    <w:rPr>
+                      <w:rFonts w:ascii="Cambria Math" w:eastAsiaTheme="minorEastAsia" w:hAnsi="Cambria Math"/>
+                      <w:i/>
+                      <w:lang w:val="en-US"/>
+                    </w:rPr>
+                  </m:ctrlPr>
+                </m:sSubPr>
+                <m:e>
+                  <m:r>
+                    <w:rPr>
+                      <w:rFonts w:ascii="Cambria Math" w:eastAsiaTheme="minorEastAsia" w:hAnsi="Cambria Math"/>
+                      <w:lang w:val="en-US"/>
+                    </w:rPr>
+                    <m:t>σ</m:t>
+                  </m:r>
+                </m:e>
+                <m:sub>
+                  <m:r>
+                    <w:rPr>
+                      <w:rFonts w:ascii="Cambria Math" w:eastAsiaTheme="minorEastAsia" w:hAnsi="Cambria Math"/>
+                      <w:lang w:val="en-US"/>
+                    </w:rPr>
+                    <m:t>X</m:t>
+                  </m:r>
+                </m:sub>
+              </m:sSub>
+            </m:den>
+          </m:f>
+          <m:r>
+            <m:rPr>
+              <m:sty m:val="bi"/>
+            </m:rPr>
+            <w:rPr>
+              <w:rFonts w:ascii="Cambria Math" w:hAnsi="Cambria Math"/>
+            </w:rPr>
+            <m:t>&lt;</m:t>
+          </m:r>
+          <m:sSub>
+            <m:sSubPr>
+              <m:ctrlPr>
+                <w:rPr>
+                  <w:rFonts w:ascii="Cambria Math" w:eastAsiaTheme="minorEastAsia" w:hAnsi="Cambria Math"/>
+                  <w:i/>
+                  <w:lang w:val="en-US"/>
+                </w:rPr>
+              </m:ctrlPr>
+            </m:sSubPr>
+            <m:e>
+              <m:r>
+                <w:rPr>
+                  <w:rFonts w:ascii="Cambria Math" w:eastAsiaTheme="minorEastAsia" w:hAnsi="Cambria Math"/>
+                  <w:lang w:val="en-US"/>
+                </w:rPr>
+                <m:t>β</m:t>
+              </m:r>
+            </m:e>
+            <m:sub>
+              <m:r>
+                <w:rPr>
+                  <w:rFonts w:ascii="Cambria Math" w:eastAsiaTheme="minorEastAsia" w:hAnsi="Cambria Math"/>
+                  <w:lang w:val="en-US"/>
+                </w:rPr>
+                <m:t>onset</m:t>
+              </m:r>
+            </m:sub>
+          </m:sSub>
+          <m:r>
+            <m:rPr>
+              <m:sty m:val="bi"/>
+            </m:rPr>
+            <w:rPr>
+              <w:rFonts w:ascii="Cambria Math" w:hAnsi="Cambria Math"/>
+            </w:rPr>
+            <m:t>&lt;</m:t>
+          </m:r>
+          <m:f>
+            <m:fPr>
+              <m:ctrlPr>
+                <w:rPr>
+                  <w:rFonts w:ascii="Cambria Math" w:eastAsiaTheme="minorEastAsia" w:hAnsi="Cambria Math"/>
+                  <w:i/>
+                  <w:lang w:val="en-US"/>
+                </w:rPr>
+              </m:ctrlPr>
+            </m:fPr>
+            <m:num>
+              <m:sSub>
+                <m:sSubPr>
+                  <m:ctrlPr>
+                    <w:rPr>
+                      <w:rFonts w:ascii="Cambria Math" w:eastAsiaTheme="minorEastAsia" w:hAnsi="Cambria Math"/>
+                      <w:i/>
+                      <w:lang w:val="en-US"/>
+                    </w:rPr>
+                  </m:ctrlPr>
+                </m:sSubPr>
+                <m:e>
+                  <m:r>
+                    <w:rPr>
+                      <w:rFonts w:ascii="Cambria Math" w:eastAsiaTheme="minorEastAsia" w:hAnsi="Cambria Math"/>
+                      <w:lang w:val="en-US"/>
+                    </w:rPr>
+                    <m:t>σ</m:t>
+                  </m:r>
+                </m:e>
+                <m:sub>
+                  <m:r>
+                    <w:rPr>
+                      <w:rFonts w:ascii="Cambria Math" w:eastAsiaTheme="minorEastAsia" w:hAnsi="Cambria Math"/>
+                      <w:lang w:val="en-US"/>
+                    </w:rPr>
+                    <m:t>Y</m:t>
+                  </m:r>
+                </m:sub>
+              </m:sSub>
+            </m:num>
+            <m:den>
+              <m:sSub>
+                <m:sSubPr>
+                  <m:ctrlPr>
+                    <w:rPr>
+                      <w:rFonts w:ascii="Cambria Math" w:eastAsiaTheme="minorEastAsia" w:hAnsi="Cambria Math"/>
+                      <w:i/>
+                      <w:lang w:val="en-US"/>
+                    </w:rPr>
+                  </m:ctrlPr>
+                </m:sSubPr>
+                <m:e>
+                  <m:r>
+                    <w:rPr>
+                      <w:rFonts w:ascii="Cambria Math" w:eastAsiaTheme="minorEastAsia" w:hAnsi="Cambria Math"/>
+                      <w:lang w:val="en-US"/>
+                    </w:rPr>
+                    <m:t>σ</m:t>
+                  </m:r>
+                </m:e>
+                <m:sub>
+                  <m:r>
+                    <w:rPr>
+                      <w:rFonts w:ascii="Cambria Math" w:eastAsiaTheme="minorEastAsia" w:hAnsi="Cambria Math"/>
+                      <w:lang w:val="en-US"/>
+                    </w:rPr>
+                    <m:t>X</m:t>
+                  </m:r>
+                </m:sub>
+              </m:sSub>
+            </m:den>
+          </m:f>
+          <m:r>
+            <m:rPr>
+              <m:sty m:val="bi"/>
+            </m:rPr>
+            <w:rPr>
+              <w:rFonts w:ascii="Cambria Math" w:hAnsi="Cambria Math"/>
+            </w:rPr>
+            <m:t>⇔</m:t>
+          </m:r>
+          <m:r>
+            <w:rPr>
+              <w:rFonts w:ascii="Cambria Math" w:hAnsi="Cambria Math"/>
+            </w:rPr>
+            <m:t>|</m:t>
+          </m:r>
+          <m:sSub>
+            <m:sSubPr>
+              <m:ctrlPr>
+                <w:rPr>
+                  <w:rFonts w:ascii="Cambria Math" w:eastAsiaTheme="minorEastAsia" w:hAnsi="Cambria Math"/>
+                  <w:i/>
+                  <w:lang w:val="en-US"/>
+                </w:rPr>
+              </m:ctrlPr>
+            </m:sSubPr>
+            <m:e>
+              <m:r>
+                <w:rPr>
+                  <w:rFonts w:ascii="Cambria Math" w:eastAsiaTheme="minorEastAsia" w:hAnsi="Cambria Math"/>
+                  <w:lang w:val="en-US"/>
+                </w:rPr>
+                <m:t>β</m:t>
+              </m:r>
+            </m:e>
+            <m:sub>
+              <m:r>
+                <w:rPr>
+                  <w:rFonts w:ascii="Cambria Math" w:eastAsiaTheme="minorEastAsia" w:hAnsi="Cambria Math"/>
+                  <w:lang w:val="en-US"/>
+                </w:rPr>
+                <m:t>onset</m:t>
+              </m:r>
+            </m:sub>
+          </m:sSub>
+          <m:r>
+            <w:rPr>
+              <w:rFonts w:ascii="Cambria Math" w:hAnsi="Cambria Math"/>
+            </w:rPr>
+            <m:t>|</m:t>
+          </m:r>
+          <m:r>
+            <w:rPr>
+              <w:rFonts w:ascii="Cambria Math" w:eastAsiaTheme="minorEastAsia" w:hAnsi="Cambria Math"/>
+              <w:lang w:val="en-US"/>
+            </w:rPr>
+            <m:t>&lt;</m:t>
+          </m:r>
+          <m:f>
+            <m:fPr>
+              <m:ctrlPr>
+                <w:rPr>
+                  <w:rFonts w:ascii="Cambria Math" w:eastAsiaTheme="minorEastAsia" w:hAnsi="Cambria Math"/>
+                  <w:i/>
+                  <w:lang w:val="en-US"/>
+                </w:rPr>
+              </m:ctrlPr>
+            </m:fPr>
+            <m:num>
+              <m:sSub>
+                <m:sSubPr>
+                  <m:ctrlPr>
+                    <w:rPr>
+                      <w:rFonts w:ascii="Cambria Math" w:eastAsiaTheme="minorEastAsia" w:hAnsi="Cambria Math"/>
+                      <w:i/>
+                      <w:lang w:val="en-US"/>
+                    </w:rPr>
+                  </m:ctrlPr>
+                </m:sSubPr>
+                <m:e>
+                  <m:r>
+                    <w:rPr>
+                      <w:rFonts w:ascii="Cambria Math" w:eastAsiaTheme="minorEastAsia" w:hAnsi="Cambria Math"/>
+                      <w:lang w:val="en-US"/>
+                    </w:rPr>
+                    <m:t>σ</m:t>
+                  </m:r>
+                </m:e>
+                <m:sub>
+                  <m:r>
+                    <w:rPr>
+                      <w:rFonts w:ascii="Cambria Math" w:eastAsiaTheme="minorEastAsia" w:hAnsi="Cambria Math"/>
+                      <w:lang w:val="en-US"/>
+                    </w:rPr>
+                    <m:t>Y</m:t>
+                  </m:r>
+                </m:sub>
+              </m:sSub>
+            </m:num>
+            <m:den>
+              <m:sSub>
+                <m:sSubPr>
+                  <m:ctrlPr>
+                    <w:rPr>
+                      <w:rFonts w:ascii="Cambria Math" w:eastAsiaTheme="minorEastAsia" w:hAnsi="Cambria Math"/>
+                      <w:i/>
+                      <w:lang w:val="en-US"/>
+                    </w:rPr>
+                  </m:ctrlPr>
+                </m:sSubPr>
+                <m:e>
+                  <m:r>
+                    <w:rPr>
+                      <w:rFonts w:ascii="Cambria Math" w:eastAsiaTheme="minorEastAsia" w:hAnsi="Cambria Math"/>
+                      <w:lang w:val="en-US"/>
+                    </w:rPr>
+                    <m:t>σ</m:t>
+                  </m:r>
+                </m:e>
+                <m:sub>
+                  <m:r>
+                    <w:rPr>
+                      <w:rFonts w:ascii="Cambria Math" w:eastAsiaTheme="minorEastAsia" w:hAnsi="Cambria Math"/>
+                      <w:lang w:val="en-US"/>
+                    </w:rPr>
+                    <m:t>X</m:t>
+                  </m:r>
+                </m:sub>
+              </m:sSub>
+            </m:den>
+          </m:f>
+        </m:oMath>
+      </m:oMathPara>
+    </w:p>
+    <w:p>
+      <w:pPr>
+        <w:ind w:firstLine="851"/>
+        <w:rPr>
+          <w:rFonts w:eastAsiaTheme="minorEastAsia"/>
+          <w:lang w:val="en-US"/>
+        </w:rPr>
+      </w:pPr>
+      <w:r>
+        <w:rPr>
+          <w:lang w:val="en-US"/>
+        </w:rPr>
+        <w:t xml:space="preserve">In practice, we observed </w:t>
+      </w:r>
+      <m:oMath>
+        <m:sSub>
+          <m:sSubPr>
+            <m:ctrlPr>
+              <w:rPr>
+                <w:rFonts w:ascii="Cambria Math" w:eastAsiaTheme="minorEastAsia" w:hAnsi="Cambria Math"/>
+                <w:i/>
+                <w:lang w:val="en-US"/>
+              </w:rPr>
+            </m:ctrlPr>
+          </m:sSubPr>
+          <m:e>
+            <m:r>
+              <w:rPr>
+                <w:rFonts w:ascii="Cambria Math" w:eastAsiaTheme="minorEastAsia" w:hAnsi="Cambria Math"/>
+                <w:lang w:val="en-US"/>
+              </w:rPr>
+              <m:t>β</m:t>
+            </m:r>
+          </m:e>
+          <m:sub>
+            <m:r>
+              <w:rPr>
+                <w:rFonts w:ascii="Cambria Math" w:eastAsiaTheme="minorEastAsia" w:hAnsi="Cambria Math"/>
+                <w:lang w:val="en-US"/>
+              </w:rPr>
+              <m:t>onset</m:t>
+            </m:r>
+          </m:sub>
+        </m:sSub>
+        <m:r>
+          <w:rPr>
+            <w:rFonts w:ascii="Cambria Math" w:eastAsiaTheme="minorEastAsia" w:hAnsi="Cambria Math"/>
+            <w:lang w:val="en-US"/>
+          </w:rPr>
+          <m:t xml:space="preserve">=0.14±0.03, </m:t>
+        </m:r>
+        <m:sSub>
+          <m:sSubPr>
+            <m:ctrlPr>
+              <w:rPr>
+                <w:rFonts w:ascii="Cambria Math" w:eastAsiaTheme="minorEastAsia" w:hAnsi="Cambria Math"/>
+                <w:i/>
+                <w:lang w:val="en-US"/>
+              </w:rPr>
+            </m:ctrlPr>
+          </m:sSubPr>
+          <m:e>
+            <m:r>
+              <w:rPr>
+                <w:rFonts w:ascii="Cambria Math" w:eastAsiaTheme="minorEastAsia" w:hAnsi="Cambria Math"/>
+                <w:lang w:val="en-US"/>
+              </w:rPr>
+              <m:t>σ</m:t>
+            </m:r>
+          </m:e>
+          <m:sub>
+            <m:r>
+              <w:rPr>
+                <w:rFonts w:ascii="Cambria Math" w:eastAsiaTheme="minorEastAsia" w:hAnsi="Cambria Math"/>
+                <w:lang w:val="en-US"/>
+              </w:rPr>
+              <m:t>X</m:t>
+            </m:r>
+          </m:sub>
+        </m:sSub>
+        <m:r>
+          <w:rPr>
+            <w:rFonts w:ascii="Cambria Math" w:eastAsiaTheme="minorEastAsia" w:hAnsi="Cambria Math"/>
+            <w:lang w:val="en-US"/>
+          </w:rPr>
+          <m:t>=33</m:t>
+        </m:r>
+      </m:oMath>
+      <w:r>
+        <w:rPr>
+          <w:rFonts w:eastAsiaTheme="minorEastAsia"/>
+          <w:lang w:val="en-US"/>
+        </w:rPr>
+        <w:t xml:space="preserve"> and </w:t>
+      </w:r>
+      <m:oMath>
+        <m:sSub>
+          <m:sSubPr>
+            <m:ctrlPr>
+              <w:rPr>
+                <w:rFonts w:ascii="Cambria Math" w:eastAsiaTheme="minorEastAsia" w:hAnsi="Cambria Math"/>
+                <w:i/>
+                <w:lang w:val="en-US"/>
+              </w:rPr>
+            </m:ctrlPr>
+          </m:sSubPr>
+          <m:e>
+            <m:r>
+              <w:rPr>
+                <w:rFonts w:ascii="Cambria Math" w:eastAsiaTheme="minorEastAsia" w:hAnsi="Cambria Math"/>
+                <w:lang w:val="en-US"/>
+              </w:rPr>
+              <m:t>σ</m:t>
+            </m:r>
+          </m:e>
+          <m:sub>
+            <m:r>
+              <w:rPr>
+                <w:rFonts w:ascii="Cambria Math" w:eastAsiaTheme="minorEastAsia" w:hAnsi="Cambria Math"/>
+                <w:lang w:val="en-US"/>
+              </w:rPr>
+              <m:t>Y</m:t>
+            </m:r>
+          </m:sub>
+        </m:sSub>
+        <m:r>
+          <w:rPr>
+            <w:rFonts w:ascii="Cambria Math" w:eastAsiaTheme="minorEastAsia" w:hAnsi="Cambria Math"/>
+            <w:lang w:val="en-US"/>
+          </w:rPr>
+          <m:t>=1</m:t>
+        </m:r>
+      </m:oMath>
+      <w:r>
+        <w:rPr>
+          <w:rFonts w:eastAsiaTheme="minorEastAsia"/>
+          <w:lang w:val="en-US"/>
+        </w:rPr>
+        <w:t xml:space="preserve"> which gives the ratio value </w:t>
+      </w:r>
+      <m:oMath>
+        <m:f>
+          <m:fPr>
+            <m:ctrlPr>
+              <w:rPr>
+                <w:rFonts w:ascii="Cambria Math" w:eastAsiaTheme="minorEastAsia" w:hAnsi="Cambria Math"/>
+                <w:i/>
+                <w:lang w:val="en-US"/>
+              </w:rPr>
+            </m:ctrlPr>
+          </m:fPr>
+          <m:num>
+            <m:sSub>
+              <m:sSubPr>
+                <m:ctrlPr>
+                  <w:rPr>
+                    <w:rFonts w:ascii="Cambria Math" w:eastAsiaTheme="minorEastAsia" w:hAnsi="Cambria Math"/>
+                    <w:i/>
+                    <w:lang w:val="en-US"/>
+                  </w:rPr>
+                </m:ctrlPr>
+              </m:sSubPr>
+              <m:e>
+                <m:r>
+                  <w:rPr>
+                    <w:rFonts w:ascii="Cambria Math" w:eastAsiaTheme="minorEastAsia" w:hAnsi="Cambria Math"/>
+                    <w:lang w:val="en-US"/>
+                  </w:rPr>
+                  <m:t>σ</m:t>
+                </m:r>
+              </m:e>
+              <m:sub>
+                <m:r>
+                  <w:rPr>
+                    <w:rFonts w:ascii="Cambria Math" w:eastAsiaTheme="minorEastAsia" w:hAnsi="Cambria Math"/>
+                    <w:lang w:val="en-US"/>
+                  </w:rPr>
+                  <m:t>Y</m:t>
+                </m:r>
+              </m:sub>
+            </m:sSub>
+          </m:num>
+          <m:den>
+            <m:sSub>
+              <m:sSubPr>
+                <m:ctrlPr>
+                  <w:rPr>
+                    <w:rFonts w:ascii="Cambria Math" w:eastAsiaTheme="minorEastAsia" w:hAnsi="Cambria Math"/>
+                    <w:i/>
+                    <w:lang w:val="en-US"/>
+                  </w:rPr>
+                </m:ctrlPr>
+              </m:sSubPr>
+              <m:e>
+                <m:r>
+                  <w:rPr>
+                    <w:rFonts w:ascii="Cambria Math" w:eastAsiaTheme="minorEastAsia" w:hAnsi="Cambria Math"/>
+                    <w:lang w:val="en-US"/>
+                  </w:rPr>
+                  <m:t>σ</m:t>
+                </m:r>
+              </m:e>
+              <m:sub>
+                <m:r>
+                  <w:rPr>
+                    <w:rFonts w:ascii="Cambria Math" w:eastAsiaTheme="minorEastAsia" w:hAnsi="Cambria Math"/>
+                    <w:lang w:val="en-US"/>
+                  </w:rPr>
+                  <m:t>X</m:t>
+                </m:r>
+              </m:sub>
+            </m:sSub>
+          </m:den>
+        </m:f>
+        <m:r>
+          <w:rPr>
+            <w:rFonts w:ascii="Cambria Math" w:eastAsiaTheme="minorEastAsia" w:hAnsi="Cambria Math"/>
+            <w:lang w:val="en-US"/>
+          </w:rPr>
+          <m:t>=</m:t>
+        </m:r>
+        <m:f>
+          <m:fPr>
+            <m:ctrlPr>
+              <w:rPr>
+                <w:rFonts w:ascii="Cambria Math" w:eastAsiaTheme="minorEastAsia" w:hAnsi="Cambria Math"/>
+                <w:i/>
+                <w:lang w:val="en-US"/>
+              </w:rPr>
+            </m:ctrlPr>
+          </m:fPr>
+          <m:num>
+            <m:r>
+              <w:rPr>
+                <w:rFonts w:ascii="Cambria Math" w:eastAsiaTheme="minorEastAsia" w:hAnsi="Cambria Math"/>
+                <w:lang w:val="en-US"/>
+              </w:rPr>
+              <m:t>1</m:t>
+            </m:r>
+          </m:num>
+          <m:den>
+            <m:r>
+              <w:rPr>
+                <w:rFonts w:ascii="Cambria Math" w:eastAsiaTheme="minorEastAsia" w:hAnsi="Cambria Math"/>
+                <w:lang w:val="en-US"/>
+              </w:rPr>
+              <m:t>33</m:t>
+            </m:r>
+          </m:den>
+        </m:f>
+        <m:r>
+          <w:rPr>
+            <w:rFonts w:ascii="Cambria Math" w:eastAsiaTheme="minorEastAsia" w:hAnsi="Cambria Math"/>
+            <w:lang w:val="en-US"/>
+          </w:rPr>
+          <m:t>≈0.03&lt;0.14=</m:t>
+        </m:r>
+        <m:sSub>
+          <m:sSubPr>
+            <m:ctrlPr>
+              <w:rPr>
+                <w:rFonts w:ascii="Cambria Math" w:eastAsiaTheme="minorEastAsia" w:hAnsi="Cambria Math"/>
+                <w:i/>
+                <w:lang w:val="en-US"/>
+              </w:rPr>
+            </m:ctrlPr>
+          </m:sSubPr>
+          <m:e>
+            <m:r>
+              <w:rPr>
+                <w:rFonts w:ascii="Cambria Math" w:eastAsiaTheme="minorEastAsia" w:hAnsi="Cambria Math"/>
+                <w:lang w:val="en-US"/>
+              </w:rPr>
+              <m:t>β</m:t>
+            </m:r>
+          </m:e>
+          <m:sub>
+            <m:r>
+              <w:rPr>
+                <w:rFonts w:ascii="Cambria Math" w:eastAsiaTheme="minorEastAsia" w:hAnsi="Cambria Math"/>
+                <w:lang w:val="en-US"/>
+              </w:rPr>
+              <m:t>onset</m:t>
+            </m:r>
+          </m:sub>
+        </m:sSub>
+      </m:oMath>
+      <w:r>
+        <w:rPr>
+          <w:rFonts w:eastAsiaTheme="minorEastAsia"/>
+          <w:lang w:val="en-US"/>
+        </w:rPr>
+        <w:t xml:space="preserve"> so the strategy is not applicable is this set up</w:t>
+      </w:r>
+      <w:r>
+        <w:rPr>
+          <w:rFonts w:eastAsiaTheme="minorEastAsia"/>
+          <w:lang w:val="en-US"/>
+        </w:rPr>
+        <w:t xml:space="preserve">. At </w:t>
+      </w:r>
+      <w:r>
+        <w:rPr>
+          <w:rFonts w:eastAsiaTheme="minorEastAsia"/>
+          <w:lang w:val="en-US"/>
+        </w:rPr>
+        <w:t>“best”</w:t>
+      </w:r>
+      <w:r>
+        <w:rPr>
+          <w:rFonts w:eastAsiaTheme="minorEastAsia"/>
+          <w:lang w:val="en-US"/>
+        </w:rPr>
+        <w:t xml:space="preserve"> we can set </w:t>
+      </w:r>
+      <m:oMath>
+        <m:r>
+          <w:rPr>
+            <w:rFonts w:ascii="Cambria Math" w:eastAsiaTheme="minorEastAsia" w:hAnsi="Cambria Math"/>
+            <w:lang w:val="en-US"/>
+          </w:rPr>
+          <m:t>ρ=1</m:t>
+        </m:r>
+      </m:oMath>
+      <w:r>
+        <w:rPr>
+          <w:rFonts w:eastAsiaTheme="minorEastAsia"/>
+          <w:lang w:val="en-US"/>
+        </w:rPr>
+        <w:t xml:space="preserve"> since the proper value would then be 4.65, yielding in the following distribution:</w:t>
+      </w:r>
+    </w:p>
+    <w:p>
+      <w:pPr>
+        <w:keepNext/>
+      </w:pPr>
+      <w:r>
+        <w:rPr>
+          <w:noProof/>
+          <w:lang w:val="en-US"/>
+        </w:rPr>
+        <w:drawing>
+          <wp:inline distT="0" distB="0" distL="0" distR="0" wp14:anchorId="7898E448" wp14:editId="273B3286">
+            <wp:extent cx="5731510" cy="1517015"/>
+            <wp:effectExtent l="0" t="0" r="2540" b="6985"/>
+            <wp:docPr id="1198623861" name="Picture 1"/>
+            <wp:cNvGraphicFramePr>
+              <a:graphicFrameLocks xmlns:a="http://schemas.openxmlformats.org/drawingml/2006/main" noChangeAspect="1"/>
+            </wp:cNvGraphicFramePr>
+            <a:graphic xmlns:a="http://schemas.openxmlformats.org/drawingml/2006/main">
+              <a:graphicData uri="http://schemas.openxmlformats.org/drawingml/2006/picture">
+                <pic:pic xmlns:pic="http://schemas.openxmlformats.org/drawingml/2006/picture">
+                  <pic:nvPicPr>
+                    <pic:cNvPr id="1198623861" name=""/>
+                    <pic:cNvPicPr/>
+                  </pic:nvPicPr>
+                  <pic:blipFill>
+                    <a:blip r:embed="rId10"/>
+                    <a:stretch>
+                      <a:fillRect/>
+                    </a:stretch>
+                  </pic:blipFill>
+                  <pic:spPr>
+                    <a:xfrm>
+                      <a:off x="0" y="0"/>
+                      <a:ext cx="5731510" cy="1517015"/>
+                    </a:xfrm>
+                    <a:prstGeom prst="rect">
+                      <a:avLst/>
+                    </a:prstGeom>
+                  </pic:spPr>
+                </pic:pic>
+              </a:graphicData>
+            </a:graphic>
+          </wp:inline>
+        </w:drawing>
+      </w:r>
+    </w:p>
+    <w:p>
+      <w:pPr>
+        <w:pStyle w:val="Caption"/>
+        <w:jc w:val="center"/>
+        <w:rPr>
+          <w:noProof/>
+          <w:lang w:val="en-US"/>
+        </w:rPr>
+      </w:pPr>
+      <w:r>
+        <w:rPr>
+          <w:lang w:val="en-US"/>
+        </w:rPr>
+        <w:t xml:space="preserve">Figure </w:t>
+      </w:r>
+      <w:r>
+        <w:fldChar w:fldCharType="begin"/>
+      </w:r>
+      <w:r>
+        <w:rPr>
+          <w:lang w:val="en-US"/>
+        </w:rPr>
+        <w:instrText xml:space="preserve"> SEQ Figure \* ARABIC </w:instrText>
+      </w:r>
+      <w:r>
+        <w:fldChar w:fldCharType="separate"/>
+      </w:r>
+      <w:r>
+        <w:rPr>
+          <w:noProof/>
+          <w:lang w:val="en-US"/>
+        </w:rPr>
+        <w:t>4</w:t>
+      </w:r>
+      <w:r>
+        <w:fldChar w:fldCharType="end"/>
+      </w:r>
+      <w:r>
+        <w:rPr>
+          <w:lang w:val="en-US"/>
+        </w:rPr>
+        <w:t xml:space="preserve"> - (x, y) multivariate distribution with correlation rho=1 (left). Empirical density plot of ratio y/x (right)</w:t>
+      </w:r>
+      <w:r>
+        <w:rPr>
+          <w:noProof/>
+          <w:lang w:val="en-US"/>
+        </w:rPr>
+        <w:t>. N=10 000</w:t>
+      </w:r>
+    </w:p>
+    <w:p>
+      <w:pPr>
+        <w:rPr>
+          <w:lang w:val="en-US"/>
+        </w:rPr>
+      </w:pPr>
+      <w:r>
+        <w:rPr>
+          <w:lang w:val="en-US"/>
+        </w:rPr>
+        <w:tab/>
+        <w:t>In this out of bound setup, one can see it “biases” the average ratio y/x, and induces a much larger variance. Hence the invalidity of th</w:t>
+      </w:r>
+      <w:r>
+        <w:rPr>
+          <w:lang w:val="en-US"/>
+        </w:rPr>
+        <w:t>is</w:t>
+      </w:r>
+      <w:r>
+        <w:rPr>
+          <w:lang w:val="en-US"/>
+        </w:rPr>
+        <w:t xml:space="preserve"> setup when the condition on ratio of standard deviation.</w:t>
+      </w:r>
+    </w:p>
+    <w:p>
+      <w:pPr>
+        <w:rPr>
+          <w:lang w:val="en-US"/>
+        </w:rPr>
+      </w:pPr>
+    </w:p>
+    <w:p>
+      <w:pPr>
+        <w:rPr>
+          <w:lang w:val="en-US"/>
+        </w:rPr>
+      </w:pPr>
+      <w:r>
+        <w:rPr>
+          <w:b/>
+          <w:bCs/>
+          <w:lang w:val="en-US"/>
+        </w:rPr>
+        <w:t>Question</w:t>
+      </w:r>
+      <w:r>
+        <w:rPr>
+          <w:lang w:val="en-US"/>
+        </w:rPr>
+        <w:t xml:space="preserve">: Is there any for rho such that we can control the mean and/or </w:t>
+      </w:r>
+      <w:proofErr w:type="spellStart"/>
+      <w:r>
+        <w:rPr>
+          <w:lang w:val="en-US"/>
+        </w:rPr>
+        <w:t>sd</w:t>
+      </w:r>
+      <w:proofErr w:type="spellEnd"/>
+      <w:r>
+        <w:rPr>
+          <w:lang w:val="en-US"/>
+        </w:rPr>
+        <w:t xml:space="preserve"> of the ratio y/x?</w:t>
+      </w:r>
+      <w:r>
+        <w:rPr>
+          <w:lang w:val="en-US"/>
+        </w:rPr>
+        <w:t xml:space="preserve"> In which setup</w:t>
+      </w:r>
+      <w:r>
+        <w:rPr>
+          <w:lang w:val="en-US"/>
+        </w:rPr>
+        <w:t>s</w:t>
+      </w:r>
+      <w:r>
+        <w:rPr>
+          <w:lang w:val="en-US"/>
+        </w:rPr>
+        <w:t>, realistic or not?</w:t>
       </w:r>
     </w:p>
     <w:sectPr>
@@ -1757,6 +4283,84 @@
       <w:szCs w:val="18"/>
     </w:rPr>
   </w:style>
+  <w:style w:type="character" w:styleId="PlaceholderText">
+    <w:name w:val="Placeholder Text"/>
+    <w:basedOn w:val="DefaultParagraphFont"/>
+    <w:uiPriority w:val="99"/>
+    <w:semiHidden/>
+    <w:rsid w:val="00E8727D"/>
+    <w:rPr>
+      <w:color w:val="666666"/>
+    </w:rPr>
+  </w:style>
+  <w:style w:type="character" w:styleId="CommentReference">
+    <w:name w:val="annotation reference"/>
+    <w:basedOn w:val="DefaultParagraphFont"/>
+    <w:uiPriority w:val="99"/>
+    <w:semiHidden/>
+    <w:unhideWhenUsed/>
+    <w:rsid w:val="00E256E5"/>
+    <w:rPr>
+      <w:sz w:val="16"/>
+      <w:szCs w:val="16"/>
+    </w:rPr>
+  </w:style>
+  <w:style w:type="paragraph" w:styleId="CommentText">
+    <w:name w:val="annotation text"/>
+    <w:basedOn w:val="Normal"/>
+    <w:link w:val="CommentTextChar"/>
+    <w:uiPriority w:val="99"/>
+    <w:semiHidden/>
+    <w:unhideWhenUsed/>
+    <w:rsid w:val="00E256E5"/>
+    <w:pPr>
+      <w:spacing w:line="240" w:lineRule="auto"/>
+    </w:pPr>
+    <w:rPr>
+      <w:sz w:val="20"/>
+      <w:szCs w:val="20"/>
+    </w:rPr>
+  </w:style>
+  <w:style w:type="character" w:customStyle="1" w:styleId="CommentTextChar">
+    <w:name w:val="Comment Text Char"/>
+    <w:basedOn w:val="DefaultParagraphFont"/>
+    <w:link w:val="CommentText"/>
+    <w:uiPriority w:val="99"/>
+    <w:semiHidden/>
+    <w:rsid w:val="00E256E5"/>
+    <w:rPr>
+      <w:sz w:val="20"/>
+      <w:szCs w:val="20"/>
+    </w:rPr>
+  </w:style>
+  <w:style w:type="paragraph" w:styleId="CommentSubject">
+    <w:name w:val="annotation subject"/>
+    <w:basedOn w:val="CommentText"/>
+    <w:next w:val="CommentText"/>
+    <w:link w:val="CommentSubjectChar"/>
+    <w:uiPriority w:val="99"/>
+    <w:semiHidden/>
+    <w:unhideWhenUsed/>
+    <w:rsid w:val="00E256E5"/>
+    <w:rPr>
+      <w:b/>
+      <w:bCs/>
+    </w:rPr>
+  </w:style>
+  <w:style w:type="character" w:customStyle="1" w:styleId="CommentSubjectChar">
+    <w:name w:val="Comment Subject Char"/>
+    <w:basedOn w:val="CommentTextChar"/>
+    <w:link w:val="CommentSubject"/>
+    <w:uiPriority w:val="99"/>
+    <w:semiHidden/>
+    <w:rsid w:val="00E256E5"/>
+    <w:rPr>
+      <w:b/>
+      <w:bCs/>
+      <w:sz w:val="20"/>
+      <w:szCs w:val="20"/>
+    </w:rPr>
+  </w:style>
 </w:styles>
 </file>
 
@@ -2053,4 +4657,16 @@
     </a:ext>
   </a:extLst>
 </a:theme>
+</file>
+
+<file path=customXml/item1.xml><?xml version="1.0" encoding="utf-8"?>
+<b:Sources xmlns:b="http://schemas.openxmlformats.org/officeDocument/2006/bibliography" xmlns="http://schemas.openxmlformats.org/officeDocument/2006/bibliography" SelectedStyle="\APASixthEditionOfficeOnline.xsl" StyleName="APA" Version="6"/>
+</file>
+
+<file path=customXml/itemProps1.xml><?xml version="1.0" encoding="utf-8"?>
+<ds:datastoreItem xmlns:ds="http://schemas.openxmlformats.org/officeDocument/2006/customXml" ds:itemID="{CF23FD8E-86A2-4F32-A671-E5E1AA5A0D4A}">
+  <ds:schemaRefs>
+    <ds:schemaRef ds:uri="http://schemas.openxmlformats.org/officeDocument/2006/bibliography"/>
+  </ds:schemaRefs>
+</ds:datastoreItem>
 </file>
</xml_diff>